<commit_message>
docs: ajout boxplots Ch4, diagramme architecture + mockup Streamlit Ch5, 12 graphiques
</commit_message>
<xml_diff>
--- a/docs/MEMOIRE.docx
+++ b/docs/MEMOIRE.docx
@@ -4972,7 +4972,7 @@
     <w:bookmarkEnd w:id="56"/>
     <w:bookmarkEnd w:id="57"/>
     <w:bookmarkEnd w:id="58"/>
-    <w:bookmarkStart w:id="90" w:name="chapitre-4-méthodologie"/>
+    <w:bookmarkStart w:id="93" w:name="chapitre-4-méthodologie"/>
     <w:p>
       <w:pPr>
         <w:pStyle w:val="Heading1"/>
@@ -5589,7 +5589,7 @@
     </w:p>
     <w:bookmarkEnd w:id="63"/>
     <w:bookmarkEnd w:id="64"/>
-    <w:bookmarkStart w:id="76" w:name="prétraitement-des-données"/>
+    <w:bookmarkStart w:id="79" w:name="prétraitement-des-données"/>
     <w:p>
       <w:pPr>
         <w:pStyle w:val="Heading2"/>
@@ -5886,7 +5886,7 @@
       </w:r>
     </w:p>
     <w:bookmarkEnd w:id="71"/>
-    <w:bookmarkStart w:id="75" w:name="X6876d3d96454d06260478c5c51446e64e3375c6"/>
+    <w:bookmarkStart w:id="78" w:name="X6876d3d96454d06260478c5c51446e64e3375c6"/>
     <w:p>
       <w:pPr>
         <w:pStyle w:val="Heading3"/>
@@ -5970,9 +5970,76 @@
         <w:t xml:space="preserve">Graphique 4.2 : Heatmap de corrélation entre les caractéristiques du dataset</w:t>
       </w:r>
     </w:p>
-    <w:bookmarkEnd w:id="75"/>
-    <w:bookmarkEnd w:id="76"/>
-    <w:bookmarkStart w:id="78" w:name="entraînement-des-modèles"/>
+    <w:p>
+      <w:pPr>
+        <w:pStyle w:val="CaptionedFigure"/>
+      </w:pPr>
+      <w:r>
+        <w:drawing>
+          <wp:inline>
+            <wp:extent cx="5334000" cy="2274643"/>
+            <wp:effectExtent b="0" l="0" r="0" t="0"/>
+            <wp:docPr descr="Boxplots des caractéristiques" title="" id="76" name="Picture"/>
+            <a:graphic>
+              <a:graphicData uri="http://schemas.openxmlformats.org/drawingml/2006/picture">
+                <pic:pic>
+                  <pic:nvPicPr>
+                    <pic:cNvPr descr="../data/processed/graphiques/02_boxplots_caracteristiques.png" id="77" name="Picture"/>
+                    <pic:cNvPicPr>
+                      <a:picLocks noChangeArrowheads="1" noChangeAspect="1"/>
+                    </pic:cNvPicPr>
+                  </pic:nvPicPr>
+                  <pic:blipFill>
+                    <a:blip r:embed="rId75"/>
+                    <a:stretch>
+                      <a:fillRect/>
+                    </a:stretch>
+                  </pic:blipFill>
+                  <pic:spPr bwMode="auto">
+                    <a:xfrm>
+                      <a:off x="0" y="0"/>
+                      <a:ext cx="5334000" cy="2274643"/>
+                    </a:xfrm>
+                    <a:prstGeom prst="rect">
+                      <a:avLst/>
+                    </a:prstGeom>
+                    <a:noFill/>
+                    <a:ln w="9525">
+                      <a:noFill/>
+                      <a:headEnd/>
+                      <a:tailEnd/>
+                    </a:ln>
+                  </pic:spPr>
+                </pic:pic>
+              </a:graphicData>
+            </a:graphic>
+          </wp:inline>
+        </w:drawing>
+      </w:r>
+    </w:p>
+    <w:p>
+      <w:pPr>
+        <w:pStyle w:val="ImageCaption"/>
+      </w:pPr>
+      <w:r>
+        <w:t xml:space="preserve">Boxplots des caractéristiques</w:t>
+      </w:r>
+    </w:p>
+    <w:p>
+      <w:pPr>
+        <w:pStyle w:val="BodyText"/>
+      </w:pPr>
+      <w:r>
+        <w:rPr>
+          <w:i/>
+          <w:iCs/>
+        </w:rPr>
+        <w:t xml:space="preserve">Graphique 4.3 : Distribution des 8 premières caractéristiques par classe (normal en vert, attaque en rouge). On observe que certaines caractéristiques présentent des distributions distinctes entre les deux classes, ce qui facilite la tâche de classification.</w:t>
+      </w:r>
+    </w:p>
+    <w:bookmarkEnd w:id="78"/>
+    <w:bookmarkEnd w:id="79"/>
+    <w:bookmarkStart w:id="81" w:name="entraînement-des-modèles"/>
     <w:p>
       <w:pPr>
         <w:pStyle w:val="Heading2"/>
@@ -6345,7 +6412,7 @@
         <w:t xml:space="preserve">Chaque modèle est entraîné sur le même ensemble d’entraînement (X_train, y_train) avec les mêmes données prétraitées. Un chronomètre mesure le temps d’entraînement de chaque modèle pour permettre une comparaison de performance temporelle.</w:t>
       </w:r>
     </w:p>
-    <w:bookmarkStart w:id="77" w:name="gestion-des-probabilités"/>
+    <w:bookmarkStart w:id="80" w:name="gestion-des-probabilités"/>
     <w:p>
       <w:pPr>
         <w:pStyle w:val="Heading3"/>
@@ -6409,9 +6476,9 @@
         <w:t xml:space="preserve">) ne peuvent pas produire de courbes ROC complètes.</w:t>
       </w:r>
     </w:p>
-    <w:bookmarkEnd w:id="77"/>
-    <w:bookmarkEnd w:id="78"/>
-    <w:bookmarkStart w:id="89" w:name="évaluation-des-performances"/>
+    <w:bookmarkEnd w:id="80"/>
+    <w:bookmarkEnd w:id="81"/>
+    <w:bookmarkStart w:id="92" w:name="évaluation-des-performances"/>
     <w:p>
       <w:pPr>
         <w:pStyle w:val="Heading2"/>
@@ -6428,7 +6495,7 @@
         <w:t xml:space="preserve">L’évaluation des modèles est réalisée à l’aide de plusieurs métriques complémentaires :</w:t>
       </w:r>
     </w:p>
-    <w:bookmarkStart w:id="79" w:name="accuracy-exactitude"/>
+    <w:bookmarkStart w:id="82" w:name="accuracy-exactitude"/>
     <w:p>
       <w:pPr>
         <w:pStyle w:val="Heading3"/>
@@ -6519,8 +6586,8 @@
         <w:t xml:space="preserve">: L’accuracy peut être trompeuse en cas de déséquilibre des classes. Si 95% du trafic est normal, un modèle qui prédit toujours « normal » aura 95% d’accuracy mais ne détectera aucune attaque.</w:t>
       </w:r>
     </w:p>
-    <w:bookmarkEnd w:id="79"/>
-    <w:bookmarkStart w:id="80" w:name="précision"/>
+    <w:bookmarkEnd w:id="82"/>
+    <w:bookmarkStart w:id="83" w:name="précision"/>
     <w:p>
       <w:pPr>
         <w:pStyle w:val="Heading3"/>
@@ -6553,8 +6620,8 @@
         <w:t xml:space="preserve">Une précision élevée signifie peu de fausses alarmes. Cette métrique est importante car les fausses alarmes coûtent du temps aux analystes de sécurité.</w:t>
       </w:r>
     </w:p>
-    <w:bookmarkEnd w:id="80"/>
-    <w:bookmarkStart w:id="81" w:name="rappel-recall"/>
+    <w:bookmarkEnd w:id="83"/>
+    <w:bookmarkStart w:id="84" w:name="rappel-recall"/>
     <w:p>
       <w:pPr>
         <w:pStyle w:val="Heading3"/>
@@ -6587,8 +6654,8 @@
         <w:t xml:space="preserve">Un rappel élevé signifie que peu d’attaques sont manquées. Cette métrique est cruciale en sécurité : une attaque non détectée peut avoir des conséquences graves.</w:t>
       </w:r>
     </w:p>
-    <w:bookmarkEnd w:id="81"/>
-    <w:bookmarkStart w:id="82" w:name="f1-score"/>
+    <w:bookmarkEnd w:id="84"/>
+    <w:bookmarkStart w:id="85" w:name="f1-score"/>
     <w:p>
       <w:pPr>
         <w:pStyle w:val="Heading3"/>
@@ -6621,8 +6688,8 @@
         <w:t xml:space="preserve">Le F1-Score est particulièrement utile quand les classes sont déséquilibrées. Un modèle avec un F1-Score élevé équilibre bien la détection des attaques et la limitation des fausses alarmes. Dans ce projet, le F1-Score est utilisé comme métrique principale pour classer les modèles.</w:t>
       </w:r>
     </w:p>
-    <w:bookmarkEnd w:id="82"/>
-    <w:bookmarkStart w:id="83" w:name="matrice-de-confusion"/>
+    <w:bookmarkEnd w:id="85"/>
+    <w:bookmarkStart w:id="86" w:name="matrice-de-confusion"/>
     <w:p>
       <w:pPr>
         <w:pStyle w:val="Heading3"/>
@@ -6778,8 +6845,8 @@
         <w:t xml:space="preserve">Chaque cellule donne le nombre d’échantillons dans chaque catégorie. La matrice de confusion permet une analyse visuelle rapide des performances.</w:t>
       </w:r>
     </w:p>
-    <w:bookmarkEnd w:id="83"/>
-    <w:bookmarkStart w:id="87" w:name="courbe-roc-et-auc"/>
+    <w:bookmarkEnd w:id="86"/>
+    <w:bookmarkStart w:id="90" w:name="courbe-roc-et-auc"/>
     <w:p>
       <w:pPr>
         <w:pStyle w:val="Heading3"/>
@@ -6875,18 +6942,18 @@
           <wp:inline>
             <wp:extent cx="5334000" cy="4252783"/>
             <wp:effectExtent b="0" l="0" r="0" t="0"/>
-            <wp:docPr descr="Courbes ROC" title="" id="85" name="Picture"/>
+            <wp:docPr descr="Courbes ROC" title="" id="88" name="Picture"/>
             <a:graphic>
               <a:graphicData uri="http://schemas.openxmlformats.org/drawingml/2006/picture">
                 <pic:pic>
                   <pic:nvPicPr>
-                    <pic:cNvPr descr="../data/processed/graphiques/04_courbes_roc.png" id="86" name="Picture"/>
+                    <pic:cNvPr descr="../data/processed/graphiques/04_courbes_roc.png" id="89" name="Picture"/>
                     <pic:cNvPicPr>
                       <a:picLocks noChangeArrowheads="1" noChangeAspect="1"/>
                     </pic:cNvPicPr>
                   </pic:nvPicPr>
                   <pic:blipFill>
-                    <a:blip r:embed="rId84"/>
+                    <a:blip r:embed="rId87"/>
                     <a:stretch>
                       <a:fillRect/>
                     </a:stretch>
@@ -6933,8 +7000,8 @@
         <w:t xml:space="preserve">Graphique 4.3 : Courbes ROC des 6 modèles avec valeurs d’AUC</w:t>
       </w:r>
     </w:p>
-    <w:bookmarkEnd w:id="87"/>
-    <w:bookmarkStart w:id="88" w:name="X74866c7c2287e1e4e9c13e17641d4a53b1e0f48"/>
+    <w:bookmarkEnd w:id="90"/>
+    <w:bookmarkStart w:id="91" w:name="X74866c7c2287e1e4e9c13e17641d4a53b1e0f48"/>
     <w:p>
       <w:pPr>
         <w:pStyle w:val="Heading3"/>
@@ -7002,10 +7069,10 @@
         </w:pict>
       </w:r>
     </w:p>
-    <w:bookmarkEnd w:id="88"/>
-    <w:bookmarkEnd w:id="89"/>
-    <w:bookmarkEnd w:id="90"/>
-    <w:bookmarkStart w:id="104" w:name="chapitre-5-réalisation"/>
+    <w:bookmarkEnd w:id="91"/>
+    <w:bookmarkEnd w:id="92"/>
+    <w:bookmarkEnd w:id="93"/>
+    <w:bookmarkStart w:id="113" w:name="chapitre-5-réalisation"/>
     <w:p>
       <w:pPr>
         <w:pStyle w:val="Heading1"/>
@@ -7014,7 +7081,7 @@
         <w:t xml:space="preserve">Chapitre 5 : Réalisation</w:t>
       </w:r>
     </w:p>
-    <w:bookmarkStart w:id="92" w:name="outils-et-technologies"/>
+    <w:bookmarkStart w:id="95" w:name="outils-et-technologies"/>
     <w:p>
       <w:pPr>
         <w:pStyle w:val="Heading2"/>
@@ -7394,7 +7461,7 @@
         </w:tc>
       </w:tr>
     </w:tbl>
-    <w:bookmarkStart w:id="91" w:name="justification-des-choix"/>
+    <w:bookmarkStart w:id="94" w:name="justification-des-choix"/>
     <w:p>
       <w:pPr>
         <w:pStyle w:val="Heading3"/>
@@ -7453,9 +7520,9 @@
         <w:t xml:space="preserve">permet de créer une interface web interactive sans nécessiter de compétences en développement web (HTML, CSS, JavaScript).</w:t>
       </w:r>
     </w:p>
-    <w:bookmarkEnd w:id="91"/>
-    <w:bookmarkEnd w:id="92"/>
-    <w:bookmarkStart w:id="94" w:name="architecture-du-système"/>
+    <w:bookmarkEnd w:id="94"/>
+    <w:bookmarkEnd w:id="95"/>
+    <w:bookmarkStart w:id="100" w:name="architecture-du-système"/>
     <w:p>
       <w:pPr>
         <w:pStyle w:val="Heading2"/>
@@ -7466,10 +7533,463 @@
     </w:p>
     <w:p>
       <w:pPr>
+        <w:pStyle w:val="CaptionedFigure"/>
+      </w:pPr>
+      <w:r>
+        <w:drawing>
+          <wp:inline>
+            <wp:extent cx="5334000" cy="3026019"/>
+            <wp:effectExtent b="0" l="0" r="0" t="0"/>
+            <wp:docPr descr="Architecture du pipeline" title="" id="97" name="Picture"/>
+            <a:graphic>
+              <a:graphicData uri="http://schemas.openxmlformats.org/drawingml/2006/picture">
+                <pic:pic>
+                  <pic:nvPicPr>
+                    <pic:cNvPr descr="../data/processed/graphiques/11_architecture_pipeline.png" id="98" name="Picture"/>
+                    <pic:cNvPicPr>
+                      <a:picLocks noChangeArrowheads="1" noChangeAspect="1"/>
+                    </pic:cNvPicPr>
+                  </pic:nvPicPr>
+                  <pic:blipFill>
+                    <a:blip r:embed="rId96"/>
+                    <a:stretch>
+                      <a:fillRect/>
+                    </a:stretch>
+                  </pic:blipFill>
+                  <pic:spPr bwMode="auto">
+                    <a:xfrm>
+                      <a:off x="0" y="0"/>
+                      <a:ext cx="5334000" cy="3026019"/>
+                    </a:xfrm>
+                    <a:prstGeom prst="rect">
+                      <a:avLst/>
+                    </a:prstGeom>
+                    <a:noFill/>
+                    <a:ln w="9525">
+                      <a:noFill/>
+                      <a:headEnd/>
+                      <a:tailEnd/>
+                    </a:ln>
+                  </pic:spPr>
+                </pic:pic>
+              </a:graphicData>
+            </a:graphic>
+          </wp:inline>
+        </w:drawing>
+      </w:r>
+    </w:p>
+    <w:p>
+      <w:pPr>
+        <w:pStyle w:val="ImageCaption"/>
+      </w:pPr>
+      <w:r>
+        <w:t xml:space="preserve">Architecture du pipeline</w:t>
+      </w:r>
+    </w:p>
+    <w:p>
+      <w:pPr>
+        <w:pStyle w:val="BodyText"/>
+      </w:pPr>
+      <w:r>
+        <w:rPr>
+          <w:i/>
+          <w:iCs/>
+        </w:rPr>
+        <w:t xml:space="preserve">Graphique 5.1 : Architecture modulaire du système NetGuard AI. Le pipeline suit un flux séquentiel : Dataset → Prétraitement → Caractéristiques → Modèles ML → Évaluation → Interface utilisateur.</w:t>
+      </w:r>
+    </w:p>
+    <w:p>
+      <w:pPr>
+        <w:pStyle w:val="BodyText"/>
+      </w:pPr>
+      <w:r>
+        <w:t xml:space="preserve">L’architecture du système est modulaire, organisée en six packages principaux :</w:t>
+      </w:r>
+    </w:p>
+    <w:p>
+      <w:pPr>
+        <w:pStyle w:val="SourceCode"/>
+      </w:pPr>
+      <w:r>
+        <w:rPr>
+          <w:rStyle w:val="VerbatimChar"/>
+        </w:rPr>
+        <w:t xml:space="preserve">NetGuard-AI/</w:t>
+      </w:r>
+      <w:r>
+        <w:br/>
+      </w:r>
+      <w:r>
+        <w:rPr>
+          <w:rStyle w:val="VerbatimChar"/>
+        </w:rPr>
+        <w:t xml:space="preserve">├── src/                      # Code source principal</w:t>
+      </w:r>
+      <w:r>
+        <w:br/>
+      </w:r>
+      <w:r>
+        <w:rPr>
+          <w:rStyle w:val="VerbatimChar"/>
+        </w:rPr>
+        <w:t xml:space="preserve">│   ├── config.py             # Configuration centralisée</w:t>
+      </w:r>
+      <w:r>
+        <w:br/>
+      </w:r>
+      <w:r>
+        <w:rPr>
+          <w:rStyle w:val="VerbatimChar"/>
+        </w:rPr>
+        <w:t xml:space="preserve">│   ├── preprocessing/        # Chargement et prétraitement</w:t>
+      </w:r>
+      <w:r>
+        <w:br/>
+      </w:r>
+      <w:r>
+        <w:rPr>
+          <w:rStyle w:val="VerbatimChar"/>
+        </w:rPr>
+        <w:t xml:space="preserve">│   │   ├── data_loader.py    # Chargement des datasets</w:t>
+      </w:r>
+      <w:r>
+        <w:br/>
+      </w:r>
+      <w:r>
+        <w:rPr>
+          <w:rStyle w:val="VerbatimChar"/>
+        </w:rPr>
+        <w:t xml:space="preserve">│   │   ├── pipeline.py       # Pipeline de prétraitement</w:t>
+      </w:r>
+      <w:r>
+        <w:br/>
+      </w:r>
+      <w:r>
+        <w:rPr>
+          <w:rStyle w:val="VerbatimChar"/>
+        </w:rPr>
+        <w:t xml:space="preserve">│   │   └── run_pipeline.py   # Exécution du pipeline</w:t>
+      </w:r>
+      <w:r>
+        <w:br/>
+      </w:r>
+      <w:r>
+        <w:rPr>
+          <w:rStyle w:val="VerbatimChar"/>
+        </w:rPr>
+        <w:t xml:space="preserve">│   ├── features/             # Extraction de caractéristiques</w:t>
+      </w:r>
+      <w:r>
+        <w:br/>
+      </w:r>
+      <w:r>
+        <w:rPr>
+          <w:rStyle w:val="VerbatimChar"/>
+        </w:rPr>
+        <w:t xml:space="preserve">│   │   └── feature_extractor.py  # PCA, SelectKBest</w:t>
+      </w:r>
+      <w:r>
+        <w:br/>
+      </w:r>
+      <w:r>
+        <w:rPr>
+          <w:rStyle w:val="VerbatimChar"/>
+        </w:rPr>
+        <w:t xml:space="preserve">│   ├── models/               # Modèles de Machine Learning</w:t>
+      </w:r>
+      <w:r>
+        <w:br/>
+      </w:r>
+      <w:r>
+        <w:rPr>
+          <w:rStyle w:val="VerbatimChar"/>
+        </w:rPr>
+        <w:t xml:space="preserve">│   │   ├── detector.py       # 6 modèles de classification</w:t>
+      </w:r>
+      <w:r>
+        <w:br/>
+      </w:r>
+      <w:r>
+        <w:rPr>
+          <w:rStyle w:val="VerbatimChar"/>
+        </w:rPr>
+        <w:t xml:space="preserve">│   │   └── compare.py        # Comparaison des modèles</w:t>
+      </w:r>
+      <w:r>
+        <w:br/>
+      </w:r>
+      <w:r>
+        <w:rPr>
+          <w:rStyle w:val="VerbatimChar"/>
+        </w:rPr>
+        <w:t xml:space="preserve">│   ├── evaluation/           # Évaluation des performances</w:t>
+      </w:r>
+      <w:r>
+        <w:br/>
+      </w:r>
+      <w:r>
+        <w:rPr>
+          <w:rStyle w:val="VerbatimChar"/>
+        </w:rPr>
+        <w:t xml:space="preserve">│   │   └── metrics.py        # Métriques et matrices</w:t>
+      </w:r>
+      <w:r>
+        <w:br/>
+      </w:r>
+      <w:r>
+        <w:rPr>
+          <w:rStyle w:val="VerbatimChar"/>
+        </w:rPr>
+        <w:t xml:space="preserve">│   └── utils/                # Utilitaires</w:t>
+      </w:r>
+      <w:r>
+        <w:br/>
+      </w:r>
+      <w:r>
+        <w:rPr>
+          <w:rStyle w:val="VerbatimChar"/>
+        </w:rPr>
+        <w:t xml:space="preserve">│       └── helpers.py        # Logging, chronomètre, sauvegarde</w:t>
+      </w:r>
+      <w:r>
+        <w:br/>
+      </w:r>
+      <w:r>
+        <w:rPr>
+          <w:rStyle w:val="VerbatimChar"/>
+        </w:rPr>
+        <w:t xml:space="preserve">├── tests/                    # Tests unitaires (93 tests)</w:t>
+      </w:r>
+      <w:r>
+        <w:br/>
+      </w:r>
+      <w:r>
+        <w:rPr>
+          <w:rStyle w:val="VerbatimChar"/>
+        </w:rPr>
+        <w:t xml:space="preserve">├── datasets/                 # Scripts de téléchargement</w:t>
+      </w:r>
+      <w:r>
+        <w:br/>
+      </w:r>
+      <w:r>
+        <w:rPr>
+          <w:rStyle w:val="VerbatimChar"/>
+        </w:rPr>
+        <w:t xml:space="preserve">├── docs/                     # Documentation</w:t>
+      </w:r>
+      <w:r>
+        <w:br/>
+      </w:r>
+      <w:r>
+        <w:rPr>
+          <w:rStyle w:val="VerbatimChar"/>
+        </w:rPr>
+        <w:t xml:space="preserve">├── app.py                    # Interface Streamlit</w:t>
+      </w:r>
+      <w:r>
+        <w:br/>
+      </w:r>
+      <w:r>
+        <w:rPr>
+          <w:rStyle w:val="VerbatimChar"/>
+        </w:rPr>
+        <w:t xml:space="preserve">├── main.py                   # Interface CLI principale</w:t>
+      </w:r>
+      <w:r>
+        <w:br/>
+      </w:r>
+      <w:r>
+        <w:rPr>
+          <w:rStyle w:val="VerbatimChar"/>
+        </w:rPr>
+        <w:t xml:space="preserve">├── train.py                  # Pipeline d'entraînement complet</w:t>
+      </w:r>
+      <w:r>
+        <w:br/>
+      </w:r>
+      <w:r>
+        <w:rPr>
+          <w:rStyle w:val="VerbatimChar"/>
+        </w:rPr>
+        <w:t xml:space="preserve">├── demo.py                   # Démonstration rapide</w:t>
+      </w:r>
+      <w:r>
+        <w:br/>
+      </w:r>
+      <w:r>
+        <w:rPr>
+          <w:rStyle w:val="VerbatimChar"/>
+        </w:rPr>
+        <w:t xml:space="preserve">└── generate_graphiques.py    # Génération des graphiques</w:t>
+      </w:r>
+    </w:p>
+    <w:bookmarkStart w:id="99" w:name="principe-de-modularité"/>
+    <w:p>
+      <w:pPr>
+        <w:pStyle w:val="Heading3"/>
+      </w:pPr>
+      <w:r>
+        <w:t xml:space="preserve">Principe de modularité</w:t>
+      </w:r>
+    </w:p>
+    <w:p>
+      <w:pPr>
         <w:pStyle w:val="FirstParagraph"/>
       </w:pPr>
       <w:r>
-        <w:t xml:space="preserve">L’architecture du système est modulaire, organisée en six packages principaux :</w:t>
+        <w:t xml:space="preserve">Chaque package a une responsabilité unique et bien définie :</w:t>
+      </w:r>
+      <w:r>
+        <w:t xml:space="preserve"> </w:t>
+      </w:r>
+      <w:r>
+        <w:t xml:space="preserve">-</w:t>
+      </w:r>
+      <w:r>
+        <w:t xml:space="preserve"> </w:t>
+      </w:r>
+      <w:r>
+        <w:rPr>
+          <w:b/>
+          <w:bCs/>
+        </w:rPr>
+        <w:t xml:space="preserve">config.py</w:t>
+      </w:r>
+      <w:r>
+        <w:t xml:space="preserve"> </w:t>
+      </w:r>
+      <w:r>
+        <w:t xml:space="preserve">: Centralise tous les paramètres (chemins, hyperparamètres, configuration des datasets)</w:t>
+      </w:r>
+      <w:r>
+        <w:t xml:space="preserve"> </w:t>
+      </w:r>
+      <w:r>
+        <w:t xml:space="preserve">-</w:t>
+      </w:r>
+      <w:r>
+        <w:t xml:space="preserve"> </w:t>
+      </w:r>
+      <w:r>
+        <w:rPr>
+          <w:b/>
+          <w:bCs/>
+        </w:rPr>
+        <w:t xml:space="preserve">preprocessing/</w:t>
+      </w:r>
+      <w:r>
+        <w:t xml:space="preserve"> </w:t>
+      </w:r>
+      <w:r>
+        <w:t xml:space="preserve">: Gère le chargement, le nettoyage et la transformation des données</w:t>
+      </w:r>
+      <w:r>
+        <w:t xml:space="preserve"> </w:t>
+      </w:r>
+      <w:r>
+        <w:t xml:space="preserve">-</w:t>
+      </w:r>
+      <w:r>
+        <w:t xml:space="preserve"> </w:t>
+      </w:r>
+      <w:r>
+        <w:rPr>
+          <w:b/>
+          <w:bCs/>
+        </w:rPr>
+        <w:t xml:space="preserve">features/</w:t>
+      </w:r>
+      <w:r>
+        <w:t xml:space="preserve"> </w:t>
+      </w:r>
+      <w:r>
+        <w:t xml:space="preserve">: Implémente la sélection et l’extraction de caractéristiques</w:t>
+      </w:r>
+      <w:r>
+        <w:t xml:space="preserve"> </w:t>
+      </w:r>
+      <w:r>
+        <w:t xml:space="preserve">-</w:t>
+      </w:r>
+      <w:r>
+        <w:t xml:space="preserve"> </w:t>
+      </w:r>
+      <w:r>
+        <w:rPr>
+          <w:b/>
+          <w:bCs/>
+        </w:rPr>
+        <w:t xml:space="preserve">models/</w:t>
+      </w:r>
+      <w:r>
+        <w:t xml:space="preserve"> </w:t>
+      </w:r>
+      <w:r>
+        <w:t xml:space="preserve">: Contient les 6 modèles de classification et la logique de comparaison</w:t>
+      </w:r>
+      <w:r>
+        <w:t xml:space="preserve"> </w:t>
+      </w:r>
+      <w:r>
+        <w:t xml:space="preserve">-</w:t>
+      </w:r>
+      <w:r>
+        <w:t xml:space="preserve"> </w:t>
+      </w:r>
+      <w:r>
+        <w:rPr>
+          <w:b/>
+          <w:bCs/>
+        </w:rPr>
+        <w:t xml:space="preserve">evaluation/</w:t>
+      </w:r>
+      <w:r>
+        <w:t xml:space="preserve"> </w:t>
+      </w:r>
+      <w:r>
+        <w:t xml:space="preserve">: Calcule toutes les métriques d’évaluation</w:t>
+      </w:r>
+      <w:r>
+        <w:t xml:space="preserve"> </w:t>
+      </w:r>
+      <w:r>
+        <w:t xml:space="preserve">-</w:t>
+      </w:r>
+      <w:r>
+        <w:t xml:space="preserve"> </w:t>
+      </w:r>
+      <w:r>
+        <w:rPr>
+          <w:b/>
+          <w:bCs/>
+        </w:rPr>
+        <w:t xml:space="preserve">utils/</w:t>
+      </w:r>
+      <w:r>
+        <w:t xml:space="preserve"> </w:t>
+      </w:r>
+      <w:r>
+        <w:t xml:space="preserve">: Fournit des fonctions transverses (logging, chronomètre, sauvegarde)</w:t>
+      </w:r>
+    </w:p>
+    <w:bookmarkEnd w:id="99"/>
+    <w:bookmarkEnd w:id="100"/>
+    <w:bookmarkStart w:id="103" w:name="pipeline-de-traitement"/>
+    <w:p>
+      <w:pPr>
+        <w:pStyle w:val="Heading2"/>
+      </w:pPr>
+      <w:r>
+        <w:t xml:space="preserve">5.3 Pipeline de traitement</w:t>
+      </w:r>
+    </w:p>
+    <w:p>
+      <w:pPr>
+        <w:pStyle w:val="FirstParagraph"/>
+      </w:pPr>
+      <w:r>
+        <w:t xml:space="preserve">Le pipeline complet de traitement se déroule en sept étapes :</w:t>
       </w:r>
     </w:p>
     <w:p>
@@ -7480,7 +8000,7 @@
         <w:rPr>
           <w:rStyle w:val="VerbatimChar"/>
         </w:rPr>
-        <w:t xml:space="preserve">NetGuard-AI/</w:t>
+        <w:t xml:space="preserve">                    ┌──────────────────────┐</w:t>
       </w:r>
       <w:r>
         <w:br/>
@@ -7489,7 +8009,7 @@
         <w:rPr>
           <w:rStyle w:val="VerbatimChar"/>
         </w:rPr>
-        <w:t xml:space="preserve">├── src/                      # Code source principal</w:t>
+        <w:t xml:space="preserve">                    │    Dataset (CSV)     │</w:t>
       </w:r>
       <w:r>
         <w:br/>
@@ -7498,7 +8018,7 @@
         <w:rPr>
           <w:rStyle w:val="VerbatimChar"/>
         </w:rPr>
-        <w:t xml:space="preserve">│   ├── config.py             # Configuration centralisée</w:t>
+        <w:t xml:space="preserve">                    └──────────┬───────────┘</w:t>
       </w:r>
       <w:r>
         <w:br/>
@@ -7507,7 +8027,7 @@
         <w:rPr>
           <w:rStyle w:val="VerbatimChar"/>
         </w:rPr>
-        <w:t xml:space="preserve">│   ├── preprocessing/        # Chargement et prétraitement</w:t>
+        <w:t xml:space="preserve">                               ↓</w:t>
       </w:r>
       <w:r>
         <w:br/>
@@ -7516,7 +8036,7 @@
         <w:rPr>
           <w:rStyle w:val="VerbatimChar"/>
         </w:rPr>
-        <w:t xml:space="preserve">│   │   ├── data_loader.py    # Chargement des datasets</w:t>
+        <w:t xml:space="preserve">                    ┌──────────────────────┐</w:t>
       </w:r>
       <w:r>
         <w:br/>
@@ -7525,7 +8045,7 @@
         <w:rPr>
           <w:rStyle w:val="VerbatimChar"/>
         </w:rPr>
-        <w:t xml:space="preserve">│   │   ├── pipeline.py       # Pipeline de prétraitement</w:t>
+        <w:t xml:space="preserve">                    │      Nettoyage       │</w:t>
       </w:r>
       <w:r>
         <w:br/>
@@ -7534,7 +8054,7 @@
         <w:rPr>
           <w:rStyle w:val="VerbatimChar"/>
         </w:rPr>
-        <w:t xml:space="preserve">│   │   └── run_pipeline.py   # Exécution du pipeline</w:t>
+        <w:t xml:space="preserve">                    │  - Suppression doublons│</w:t>
       </w:r>
       <w:r>
         <w:br/>
@@ -7543,7 +8063,7 @@
         <w:rPr>
           <w:rStyle w:val="VerbatimChar"/>
         </w:rPr>
-        <w:t xml:space="preserve">│   ├── features/             # Extraction de caractéristiques</w:t>
+        <w:t xml:space="preserve">                    │  - Gestion NaN/Inf   │</w:t>
       </w:r>
       <w:r>
         <w:br/>
@@ -7552,7 +8072,7 @@
         <w:rPr>
           <w:rStyle w:val="VerbatimChar"/>
         </w:rPr>
-        <w:t xml:space="preserve">│   │   └── feature_extractor.py  # PCA, SelectKBest</w:t>
+        <w:t xml:space="preserve">                    └──────────┬───────────┘</w:t>
       </w:r>
       <w:r>
         <w:br/>
@@ -7561,7 +8081,7 @@
         <w:rPr>
           <w:rStyle w:val="VerbatimChar"/>
         </w:rPr>
-        <w:t xml:space="preserve">│   ├── models/               # Modèles de Machine Learning</w:t>
+        <w:t xml:space="preserve">                               ↓</w:t>
       </w:r>
       <w:r>
         <w:br/>
@@ -7570,7 +8090,7 @@
         <w:rPr>
           <w:rStyle w:val="VerbatimChar"/>
         </w:rPr>
-        <w:t xml:space="preserve">│   │   ├── detector.py       # 6 modèles de classification</w:t>
+        <w:t xml:space="preserve">                    ┌──────────────────────┐</w:t>
       </w:r>
       <w:r>
         <w:br/>
@@ -7579,7 +8099,7 @@
         <w:rPr>
           <w:rStyle w:val="VerbatimChar"/>
         </w:rPr>
-        <w:t xml:space="preserve">│   │   └── compare.py        # Comparaison des modèles</w:t>
+        <w:t xml:space="preserve">                    │    Prétraitement     │</w:t>
       </w:r>
       <w:r>
         <w:br/>
@@ -7588,7 +8108,7 @@
         <w:rPr>
           <w:rStyle w:val="VerbatimChar"/>
         </w:rPr>
-        <w:t xml:space="preserve">│   ├── evaluation/           # Évaluation des performances</w:t>
+        <w:t xml:space="preserve">                    │  - Normalisation     │</w:t>
       </w:r>
       <w:r>
         <w:br/>
@@ -7597,7 +8117,7 @@
         <w:rPr>
           <w:rStyle w:val="VerbatimChar"/>
         </w:rPr>
-        <w:t xml:space="preserve">│   │   └── metrics.py        # Métriques et matrices</w:t>
+        <w:t xml:space="preserve">                    │  - Encodage          │</w:t>
       </w:r>
       <w:r>
         <w:br/>
@@ -7606,7 +8126,7 @@
         <w:rPr>
           <w:rStyle w:val="VerbatimChar"/>
         </w:rPr>
-        <w:t xml:space="preserve">│   └── utils/                # Utilitaires</w:t>
+        <w:t xml:space="preserve">                    └──────────┬───────────┘</w:t>
       </w:r>
       <w:r>
         <w:br/>
@@ -7615,7 +8135,7 @@
         <w:rPr>
           <w:rStyle w:val="VerbatimChar"/>
         </w:rPr>
-        <w:t xml:space="preserve">│       └── helpers.py        # Logging, chronomètre, sauvegarde</w:t>
+        <w:t xml:space="preserve">                               ↓</w:t>
       </w:r>
       <w:r>
         <w:br/>
@@ -7624,7 +8144,7 @@
         <w:rPr>
           <w:rStyle w:val="VerbatimChar"/>
         </w:rPr>
-        <w:t xml:space="preserve">├── tests/                    # Tests unitaires (93 tests)</w:t>
+        <w:t xml:space="preserve">                    ┌──────────────────────┐</w:t>
       </w:r>
       <w:r>
         <w:br/>
@@ -7633,7 +8153,7 @@
         <w:rPr>
           <w:rStyle w:val="VerbatimChar"/>
         </w:rPr>
-        <w:t xml:space="preserve">├── datasets/                 # Scripts de téléchargement</w:t>
+        <w:t xml:space="preserve">                    │  Sélection variables │</w:t>
       </w:r>
       <w:r>
         <w:br/>
@@ -7642,7 +8162,7 @@
         <w:rPr>
           <w:rStyle w:val="VerbatimChar"/>
         </w:rPr>
-        <w:t xml:space="preserve">├── docs/                     # Documentation</w:t>
+        <w:t xml:space="preserve">                    │  - ANOVA F-test      │</w:t>
       </w:r>
       <w:r>
         <w:br/>
@@ -7651,7 +8171,7 @@
         <w:rPr>
           <w:rStyle w:val="VerbatimChar"/>
         </w:rPr>
-        <w:t xml:space="preserve">├── app.py                    # Interface Streamlit</w:t>
+        <w:t xml:space="preserve">                    │  - Feature selection │</w:t>
       </w:r>
       <w:r>
         <w:br/>
@@ -7660,7 +8180,7 @@
         <w:rPr>
           <w:rStyle w:val="VerbatimChar"/>
         </w:rPr>
-        <w:t xml:space="preserve">├── main.py                   # Interface CLI principale</w:t>
+        <w:t xml:space="preserve">                    └──────────┬───────────┘</w:t>
       </w:r>
       <w:r>
         <w:br/>
@@ -7669,7 +8189,7 @@
         <w:rPr>
           <w:rStyle w:val="VerbatimChar"/>
         </w:rPr>
-        <w:t xml:space="preserve">├── train.py                  # Pipeline d'entraînement complet</w:t>
+        <w:t xml:space="preserve">                               ↓</w:t>
       </w:r>
       <w:r>
         <w:br/>
@@ -7678,7 +8198,7 @@
         <w:rPr>
           <w:rStyle w:val="VerbatimChar"/>
         </w:rPr>
-        <w:t xml:space="preserve">├── demo.py                   # Démonstration rapide</w:t>
+        <w:t xml:space="preserve">                    ┌──────────────────────┐</w:t>
       </w:r>
       <w:r>
         <w:br/>
@@ -7687,16 +8207,169 @@
         <w:rPr>
           <w:rStyle w:val="VerbatimChar"/>
         </w:rPr>
-        <w:t xml:space="preserve">└── generate_graphiques.py    # Génération des graphiques</w:t>
-      </w:r>
-    </w:p>
-    <w:bookmarkStart w:id="93" w:name="principe-de-modularité"/>
+        <w:t xml:space="preserve">                    │    Entraînement      │</w:t>
+      </w:r>
+      <w:r>
+        <w:br/>
+      </w:r>
+      <w:r>
+        <w:rPr>
+          <w:rStyle w:val="VerbatimChar"/>
+        </w:rPr>
+        <w:t xml:space="preserve">                    │  - 6 modèles ML      │</w:t>
+      </w:r>
+      <w:r>
+        <w:br/>
+      </w:r>
+      <w:r>
+        <w:rPr>
+          <w:rStyle w:val="VerbatimChar"/>
+        </w:rPr>
+        <w:t xml:space="preserve">                    │  - Fit sur X_train   │</w:t>
+      </w:r>
+      <w:r>
+        <w:br/>
+      </w:r>
+      <w:r>
+        <w:rPr>
+          <w:rStyle w:val="VerbatimChar"/>
+        </w:rPr>
+        <w:t xml:space="preserve">                    └──────────┬───────────┘</w:t>
+      </w:r>
+      <w:r>
+        <w:br/>
+      </w:r>
+      <w:r>
+        <w:rPr>
+          <w:rStyle w:val="VerbatimChar"/>
+        </w:rPr>
+        <w:t xml:space="preserve">                               ↓</w:t>
+      </w:r>
+      <w:r>
+        <w:br/>
+      </w:r>
+      <w:r>
+        <w:rPr>
+          <w:rStyle w:val="VerbatimChar"/>
+        </w:rPr>
+        <w:t xml:space="preserve">                    ┌──────────────────────┐</w:t>
+      </w:r>
+      <w:r>
+        <w:br/>
+      </w:r>
+      <w:r>
+        <w:rPr>
+          <w:rStyle w:val="VerbatimChar"/>
+        </w:rPr>
+        <w:t xml:space="preserve">                    │     Prédiction       │</w:t>
+      </w:r>
+      <w:r>
+        <w:br/>
+      </w:r>
+      <w:r>
+        <w:rPr>
+          <w:rStyle w:val="VerbatimChar"/>
+        </w:rPr>
+        <w:t xml:space="preserve">                    │  - Predict sur X_test│</w:t>
+      </w:r>
+      <w:r>
+        <w:br/>
+      </w:r>
+      <w:r>
+        <w:rPr>
+          <w:rStyle w:val="VerbatimChar"/>
+        </w:rPr>
+        <w:t xml:space="preserve">                    │  - Probabilités      │</w:t>
+      </w:r>
+      <w:r>
+        <w:br/>
+      </w:r>
+      <w:r>
+        <w:rPr>
+          <w:rStyle w:val="VerbatimChar"/>
+        </w:rPr>
+        <w:t xml:space="preserve">                    └──────────┬───────────┘</w:t>
+      </w:r>
+      <w:r>
+        <w:br/>
+      </w:r>
+      <w:r>
+        <w:rPr>
+          <w:rStyle w:val="VerbatimChar"/>
+        </w:rPr>
+        <w:t xml:space="preserve">                               ↓</w:t>
+      </w:r>
+      <w:r>
+        <w:br/>
+      </w:r>
+      <w:r>
+        <w:rPr>
+          <w:rStyle w:val="VerbatimChar"/>
+        </w:rPr>
+        <w:t xml:space="preserve">                    ┌──────────────────────┐</w:t>
+      </w:r>
+      <w:r>
+        <w:br/>
+      </w:r>
+      <w:r>
+        <w:rPr>
+          <w:rStyle w:val="VerbatimChar"/>
+        </w:rPr>
+        <w:t xml:space="preserve">                    │     Évaluation       │</w:t>
+      </w:r>
+      <w:r>
+        <w:br/>
+      </w:r>
+      <w:r>
+        <w:rPr>
+          <w:rStyle w:val="VerbatimChar"/>
+        </w:rPr>
+        <w:t xml:space="preserve">                    │  - Métriques         │</w:t>
+      </w:r>
+      <w:r>
+        <w:br/>
+      </w:r>
+      <w:r>
+        <w:rPr>
+          <w:rStyle w:val="VerbatimChar"/>
+        </w:rPr>
+        <w:t xml:space="preserve">                    │  - Matrice confusion │</w:t>
+      </w:r>
+      <w:r>
+        <w:br/>
+      </w:r>
+      <w:r>
+        <w:rPr>
+          <w:rStyle w:val="VerbatimChar"/>
+        </w:rPr>
+        <w:t xml:space="preserve">                    │  - Courbes ROC       │</w:t>
+      </w:r>
+      <w:r>
+        <w:br/>
+      </w:r>
+      <w:r>
+        <w:rPr>
+          <w:rStyle w:val="VerbatimChar"/>
+        </w:rPr>
+        <w:t xml:space="preserve">                    └──────────────────────┘</w:t>
+      </w:r>
+    </w:p>
+    <w:bookmarkStart w:id="101" w:name="X5ef923b4054e40aa46cdf90d594fb8b469afca4"/>
     <w:p>
       <w:pPr>
         <w:pStyle w:val="Heading3"/>
       </w:pPr>
       <w:r>
-        <w:t xml:space="preserve">Principe de modularité</w:t>
+        <w:t xml:space="preserve">Détail du pipeline d’entraînement (</w:t>
+      </w:r>
+      <w:r>
+        <w:rPr>
+          <w:rStyle w:val="VerbatimChar"/>
+        </w:rPr>
+        <w:t xml:space="preserve">train.py</w:t>
+      </w:r>
+      <w:r>
+        <w:t xml:space="preserve">)</w:t>
       </w:r>
     </w:p>
     <w:p>
@@ -7704,150 +8377,225 @@
         <w:pStyle w:val="FirstParagraph"/>
       </w:pPr>
       <w:r>
-        <w:t xml:space="preserve">Chaque package a une responsabilité unique et bien définie :</w:t>
-      </w:r>
-      <w:r>
-        <w:t xml:space="preserve"> </w:t>
-      </w:r>
-      <w:r>
-        <w:t xml:space="preserve">-</w:t>
-      </w:r>
-      <w:r>
-        <w:t xml:space="preserve"> </w:t>
-      </w:r>
-      <w:r>
-        <w:rPr>
-          <w:b/>
-          <w:bCs/>
-        </w:rPr>
-        <w:t xml:space="preserve">config.py</w:t>
-      </w:r>
-      <w:r>
-        <w:t xml:space="preserve"> </w:t>
-      </w:r>
-      <w:r>
-        <w:t xml:space="preserve">: Centralise tous les paramètres (chemins, hyperparamètres, configuration des datasets)</w:t>
-      </w:r>
-      <w:r>
-        <w:t xml:space="preserve"> </w:t>
-      </w:r>
-      <w:r>
-        <w:t xml:space="preserve">-</w:t>
-      </w:r>
-      <w:r>
-        <w:t xml:space="preserve"> </w:t>
-      </w:r>
-      <w:r>
-        <w:rPr>
-          <w:b/>
-          <w:bCs/>
-        </w:rPr>
-        <w:t xml:space="preserve">preprocessing/</w:t>
-      </w:r>
-      <w:r>
-        <w:t xml:space="preserve"> </w:t>
-      </w:r>
-      <w:r>
-        <w:t xml:space="preserve">: Gère le chargement, le nettoyage et la transformation des données</w:t>
-      </w:r>
-      <w:r>
-        <w:t xml:space="preserve"> </w:t>
-      </w:r>
-      <w:r>
-        <w:t xml:space="preserve">-</w:t>
-      </w:r>
-      <w:r>
-        <w:t xml:space="preserve"> </w:t>
-      </w:r>
-      <w:r>
-        <w:rPr>
-          <w:b/>
-          <w:bCs/>
-        </w:rPr>
-        <w:t xml:space="preserve">features/</w:t>
-      </w:r>
-      <w:r>
-        <w:t xml:space="preserve"> </w:t>
-      </w:r>
-      <w:r>
-        <w:t xml:space="preserve">: Implémente la sélection et l’extraction de caractéristiques</w:t>
-      </w:r>
-      <w:r>
-        <w:t xml:space="preserve"> </w:t>
-      </w:r>
-      <w:r>
-        <w:t xml:space="preserve">-</w:t>
-      </w:r>
-      <w:r>
-        <w:t xml:space="preserve"> </w:t>
-      </w:r>
-      <w:r>
-        <w:rPr>
-          <w:b/>
-          <w:bCs/>
-        </w:rPr>
-        <w:t xml:space="preserve">models/</w:t>
-      </w:r>
-      <w:r>
-        <w:t xml:space="preserve"> </w:t>
-      </w:r>
-      <w:r>
-        <w:t xml:space="preserve">: Contient les 6 modèles de classification et la logique de comparaison</w:t>
-      </w:r>
-      <w:r>
-        <w:t xml:space="preserve"> </w:t>
-      </w:r>
-      <w:r>
-        <w:t xml:space="preserve">-</w:t>
-      </w:r>
-      <w:r>
-        <w:t xml:space="preserve"> </w:t>
-      </w:r>
-      <w:r>
-        <w:rPr>
-          <w:b/>
-          <w:bCs/>
-        </w:rPr>
-        <w:t xml:space="preserve">evaluation/</w:t>
-      </w:r>
-      <w:r>
-        <w:t xml:space="preserve"> </w:t>
-      </w:r>
-      <w:r>
-        <w:t xml:space="preserve">: Calcule toutes les métriques d’évaluation</w:t>
-      </w:r>
-      <w:r>
-        <w:t xml:space="preserve"> </w:t>
-      </w:r>
-      <w:r>
-        <w:t xml:space="preserve">-</w:t>
-      </w:r>
-      <w:r>
-        <w:t xml:space="preserve"> </w:t>
-      </w:r>
-      <w:r>
-        <w:rPr>
-          <w:b/>
-          <w:bCs/>
-        </w:rPr>
-        <w:t xml:space="preserve">utils/</w:t>
-      </w:r>
-      <w:r>
-        <w:t xml:space="preserve"> </w:t>
-      </w:r>
-      <w:r>
-        <w:t xml:space="preserve">: Fournit des fonctions transverses (logging, chronomètre, sauvegarde)</w:t>
-      </w:r>
-    </w:p>
-    <w:bookmarkEnd w:id="93"/>
-    <w:bookmarkEnd w:id="94"/>
-    <w:bookmarkStart w:id="97" w:name="pipeline-de-traitement"/>
+        <w:t xml:space="preserve">Le script</w:t>
+      </w:r>
+      <w:r>
+        <w:t xml:space="preserve"> </w:t>
+      </w:r>
+      <w:r>
+        <w:rPr>
+          <w:rStyle w:val="VerbatimChar"/>
+        </w:rPr>
+        <w:t xml:space="preserve">train.py</w:t>
+      </w:r>
+      <w:r>
+        <w:t xml:space="preserve"> </w:t>
+      </w:r>
+      <w:r>
+        <w:t xml:space="preserve">orchestre l’ensemble du pipeline d’entraînement :</w:t>
+      </w:r>
+    </w:p>
+    <w:p>
+      <w:pPr>
+        <w:pStyle w:val="Compact"/>
+        <w:numPr>
+          <w:ilvl w:val="0"/>
+          <w:numId w:val="1029"/>
+        </w:numPr>
+      </w:pPr>
+      <w:r>
+        <w:rPr>
+          <w:b/>
+          <w:bCs/>
+        </w:rPr>
+        <w:t xml:space="preserve">Chargement du dataset</w:t>
+      </w:r>
+      <w:r>
+        <w:t xml:space="preserve"> </w:t>
+      </w:r>
+      <w:r>
+        <w:t xml:space="preserve">: Lit le fichier CSV et extrait les colonnes pertinentes</w:t>
+      </w:r>
+    </w:p>
+    <w:p>
+      <w:pPr>
+        <w:pStyle w:val="Compact"/>
+        <w:numPr>
+          <w:ilvl w:val="0"/>
+          <w:numId w:val="1029"/>
+        </w:numPr>
+      </w:pPr>
+      <w:r>
+        <w:rPr>
+          <w:b/>
+          <w:bCs/>
+        </w:rPr>
+        <w:t xml:space="preserve">Exécution du pipeline de prétraitement</w:t>
+      </w:r>
+      <w:r>
+        <w:t xml:space="preserve"> </w:t>
+      </w:r>
+      <w:r>
+        <w:t xml:space="preserve">: Nettoie, normalise et sépare les données</w:t>
+      </w:r>
+    </w:p>
+    <w:p>
+      <w:pPr>
+        <w:pStyle w:val="Compact"/>
+        <w:numPr>
+          <w:ilvl w:val="0"/>
+          <w:numId w:val="1029"/>
+        </w:numPr>
+      </w:pPr>
+      <w:r>
+        <w:rPr>
+          <w:b/>
+          <w:bCs/>
+        </w:rPr>
+        <w:t xml:space="preserve">Entraînement des 6 modèles</w:t>
+      </w:r>
+      <w:r>
+        <w:t xml:space="preserve"> </w:t>
+      </w:r>
+      <w:r>
+        <w:t xml:space="preserve">: Chaque modèle est entraîné avec chronométrage</w:t>
+      </w:r>
+    </w:p>
+    <w:p>
+      <w:pPr>
+        <w:pStyle w:val="Compact"/>
+        <w:numPr>
+          <w:ilvl w:val="0"/>
+          <w:numId w:val="1029"/>
+        </w:numPr>
+      </w:pPr>
+      <w:r>
+        <w:rPr>
+          <w:b/>
+          <w:bCs/>
+        </w:rPr>
+        <w:t xml:space="preserve">Évaluation</w:t>
+      </w:r>
+      <w:r>
+        <w:t xml:space="preserve"> </w:t>
+      </w:r>
+      <w:r>
+        <w:t xml:space="preserve">: Calcul de toutes les métriques (accuracy, précision, rappel, F1, matrice)</w:t>
+      </w:r>
+    </w:p>
+    <w:p>
+      <w:pPr>
+        <w:pStyle w:val="Compact"/>
+        <w:numPr>
+          <w:ilvl w:val="0"/>
+          <w:numId w:val="1029"/>
+        </w:numPr>
+      </w:pPr>
+      <w:r>
+        <w:rPr>
+          <w:b/>
+          <w:bCs/>
+        </w:rPr>
+        <w:t xml:space="preserve">Comparaison</w:t>
+      </w:r>
+      <w:r>
+        <w:t xml:space="preserve"> </w:t>
+      </w:r>
+      <w:r>
+        <w:t xml:space="preserve">: Classement des modèles par F1-Score avec tableau formaté</w:t>
+      </w:r>
+    </w:p>
+    <w:p>
+      <w:pPr>
+        <w:pStyle w:val="Compact"/>
+        <w:numPr>
+          <w:ilvl w:val="0"/>
+          <w:numId w:val="1029"/>
+        </w:numPr>
+      </w:pPr>
+      <w:r>
+        <w:rPr>
+          <w:b/>
+          <w:bCs/>
+        </w:rPr>
+        <w:t xml:space="preserve">Sauvegarde</w:t>
+      </w:r>
+      <w:r>
+        <w:t xml:space="preserve"> </w:t>
+      </w:r>
+      <w:r>
+        <w:t xml:space="preserve">: Meilleur modèle et rapport d’entraînement sauvegardés dans</w:t>
+      </w:r>
+      <w:r>
+        <w:t xml:space="preserve"> </w:t>
+      </w:r>
+      <w:r>
+        <w:rPr>
+          <w:rStyle w:val="VerbatimChar"/>
+        </w:rPr>
+        <w:t xml:space="preserve">data/processed/</w:t>
+      </w:r>
+    </w:p>
+    <w:bookmarkEnd w:id="101"/>
+    <w:bookmarkStart w:id="102" w:name="gestion-des-erreurs"/>
+    <w:p>
+      <w:pPr>
+        <w:pStyle w:val="Heading3"/>
+      </w:pPr>
+      <w:r>
+        <w:t xml:space="preserve">Gestion des erreurs</w:t>
+      </w:r>
+    </w:p>
+    <w:p>
+      <w:pPr>
+        <w:pStyle w:val="FirstParagraph"/>
+      </w:pPr>
+      <w:r>
+        <w:t xml:space="preserve">Le système inclut une gestion complète des erreurs :</w:t>
+      </w:r>
+      <w:r>
+        <w:t xml:space="preserve"> </w:t>
+      </w:r>
+      <w:r>
+        <w:t xml:space="preserve">- Détection et rapport des colonnes manquantes</w:t>
+      </w:r>
+      <w:r>
+        <w:t xml:space="preserve"> </w:t>
+      </w:r>
+      <w:r>
+        <w:t xml:space="preserve">- Gestion des valeurs aberrantes (NaN, Inf)</w:t>
+      </w:r>
+      <w:r>
+        <w:t xml:space="preserve"> </w:t>
+      </w:r>
+      <w:r>
+        <w:t xml:space="preserve">- Messages d’erreur explicites en cas d’échec</w:t>
+      </w:r>
+      <w:r>
+        <w:t xml:space="preserve"> </w:t>
+      </w:r>
+      <w:r>
+        <w:t xml:space="preserve">- Journalisation (logging) de toutes les étapes</w:t>
+      </w:r>
+    </w:p>
+    <w:bookmarkEnd w:id="102"/>
+    <w:bookmarkEnd w:id="103"/>
+    <w:bookmarkStart w:id="111" w:name="interface-utilisateur"/>
     <w:p>
       <w:pPr>
         <w:pStyle w:val="Heading2"/>
       </w:pPr>
       <w:r>
-        <w:t xml:space="preserve">5.3 Pipeline de traitement</w:t>
+        <w:t xml:space="preserve">5.4 Interface utilisateur</w:t>
+      </w:r>
+    </w:p>
+    <w:bookmarkStart w:id="107" w:name="interface-en-ligne-de-commande-cli"/>
+    <w:p>
+      <w:pPr>
+        <w:pStyle w:val="Heading3"/>
+      </w:pPr>
+      <w:r>
+        <w:t xml:space="preserve">Interface en ligne de commande (CLI)</w:t>
       </w:r>
     </w:p>
     <w:p>
@@ -7855,7 +8603,16 @@
         <w:pStyle w:val="FirstParagraph"/>
       </w:pPr>
       <w:r>
-        <w:t xml:space="preserve">Le pipeline complet de traitement se déroule en sept étapes :</w:t>
+        <w:t xml:space="preserve">L’interface CLI (</w:t>
+      </w:r>
+      <w:r>
+        <w:rPr>
+          <w:rStyle w:val="VerbatimChar"/>
+        </w:rPr>
+        <w:t xml:space="preserve">main.py</w:t>
+      </w:r>
+      <w:r>
+        <w:t xml:space="preserve">) permet d’exécuter le pipeline complet depuis le terminal :</w:t>
       </w:r>
     </w:p>
     <w:p>
@@ -7866,7 +8623,7 @@
         <w:rPr>
           <w:rStyle w:val="VerbatimChar"/>
         </w:rPr>
-        <w:t xml:space="preserve">                    ┌──────────────────────┐</w:t>
+        <w:t xml:space="preserve"># Pipeline complet avec le modèle par défaut (Random Forest)</w:t>
       </w:r>
       <w:r>
         <w:br/>
@@ -7875,16 +8632,19 @@
         <w:rPr>
           <w:rStyle w:val="VerbatimChar"/>
         </w:rPr>
-        <w:t xml:space="preserve">                    │    Dataset (CSV)     │</w:t>
+        <w:t xml:space="preserve">python main.py</w:t>
       </w:r>
       <w:r>
         <w:br/>
       </w:r>
       <w:r>
+        <w:br/>
+      </w:r>
+      <w:r>
         <w:rPr>
           <w:rStyle w:val="VerbatimChar"/>
         </w:rPr>
-        <w:t xml:space="preserve">                    └──────────┬───────────┘</w:t>
+        <w:t xml:space="preserve"># Utiliser un modèle spécifique</w:t>
       </w:r>
       <w:r>
         <w:br/>
@@ -7893,16 +8653,19 @@
         <w:rPr>
           <w:rStyle w:val="VerbatimChar"/>
         </w:rPr>
-        <w:t xml:space="preserve">                               ↓</w:t>
+        <w:t xml:space="preserve">python main.py --modele svm</w:t>
       </w:r>
       <w:r>
         <w:br/>
       </w:r>
       <w:r>
+        <w:br/>
+      </w:r>
+      <w:r>
         <w:rPr>
           <w:rStyle w:val="VerbatimChar"/>
         </w:rPr>
-        <w:t xml:space="preserve">                    ┌──────────────────────┐</w:t>
+        <w:t xml:space="preserve"># Utiliser le dataset CICIDS2017</w:t>
       </w:r>
       <w:r>
         <w:br/>
@@ -7911,16 +8674,19 @@
         <w:rPr>
           <w:rStyle w:val="VerbatimChar"/>
         </w:rPr>
-        <w:t xml:space="preserve">                    │      Nettoyage       │</w:t>
+        <w:t xml:space="preserve">python main.py --dataset cicids2017</w:t>
       </w:r>
       <w:r>
         <w:br/>
       </w:r>
       <w:r>
+        <w:br/>
+      </w:r>
+      <w:r>
         <w:rPr>
           <w:rStyle w:val="VerbatimChar"/>
         </w:rPr>
-        <w:t xml:space="preserve">                    │  - Suppression doublons│</w:t>
+        <w:t xml:space="preserve"># Comparer tous les modèles</w:t>
       </w:r>
       <w:r>
         <w:br/>
@@ -7929,914 +8695,349 @@
         <w:rPr>
           <w:rStyle w:val="VerbatimChar"/>
         </w:rPr>
-        <w:t xml:space="preserve">                    │  - Gestion NaN/Inf   │</w:t>
-      </w:r>
-      <w:r>
-        <w:br/>
+        <w:t xml:space="preserve">python main.py --compare</w:t>
+      </w:r>
+    </w:p>
+    <w:p>
+      <w:pPr>
+        <w:pStyle w:val="CaptionedFigure"/>
+      </w:pPr>
+      <w:r>
+        <w:drawing>
+          <wp:inline>
+            <wp:extent cx="5334000" cy="3712175"/>
+            <wp:effectExtent b="0" l="0" r="0" t="0"/>
+            <wp:docPr descr="Interface Streamlit" title="" id="105" name="Picture"/>
+            <a:graphic>
+              <a:graphicData uri="http://schemas.openxmlformats.org/drawingml/2006/picture">
+                <pic:pic>
+                  <pic:nvPicPr>
+                    <pic:cNvPr descr="../data/processed/graphiques/12_interface_streamlit.png" id="106" name="Picture"/>
+                    <pic:cNvPicPr>
+                      <a:picLocks noChangeArrowheads="1" noChangeAspect="1"/>
+                    </pic:cNvPicPr>
+                  </pic:nvPicPr>
+                  <pic:blipFill>
+                    <a:blip r:embed="rId104"/>
+                    <a:stretch>
+                      <a:fillRect/>
+                    </a:stretch>
+                  </pic:blipFill>
+                  <pic:spPr bwMode="auto">
+                    <a:xfrm>
+                      <a:off x="0" y="0"/>
+                      <a:ext cx="5334000" cy="3712175"/>
+                    </a:xfrm>
+                    <a:prstGeom prst="rect">
+                      <a:avLst/>
+                    </a:prstGeom>
+                    <a:noFill/>
+                    <a:ln w="9525">
+                      <a:noFill/>
+                      <a:headEnd/>
+                      <a:tailEnd/>
+                    </a:ln>
+                  </pic:spPr>
+                </pic:pic>
+              </a:graphicData>
+            </a:graphic>
+          </wp:inline>
+        </w:drawing>
+      </w:r>
+    </w:p>
+    <w:p>
+      <w:pPr>
+        <w:pStyle w:val="ImageCaption"/>
+      </w:pPr>
+      <w:r>
+        <w:t xml:space="preserve">Interface Streamlit</w:t>
+      </w:r>
+    </w:p>
+    <w:p>
+      <w:pPr>
+        <w:pStyle w:val="BodyText"/>
+      </w:pPr>
+      <w:r>
+        <w:rPr>
+          <w:i/>
+          <w:iCs/>
+        </w:rPr>
+        <w:t xml:space="preserve">Graphique 5.2 : Interface utilisateur Streamlit. Barre latérale de configuration (gauche), résultat de prédiction avec code couleur, cartes métriques et tableau de résultats (droite).</w:t>
+      </w:r>
+    </w:p>
+    <w:bookmarkEnd w:id="107"/>
+    <w:bookmarkStart w:id="108" w:name="interface-web-streamlit-app.py"/>
+    <w:p>
+      <w:pPr>
+        <w:pStyle w:val="Heading3"/>
+      </w:pPr>
+      <w:r>
+        <w:t xml:space="preserve">Interface web Streamlit (</w:t>
       </w:r>
       <w:r>
         <w:rPr>
           <w:rStyle w:val="VerbatimChar"/>
         </w:rPr>
-        <w:t xml:space="preserve">                    └──────────┬───────────┘</w:t>
-      </w:r>
-      <w:r>
-        <w:br/>
+        <w:t xml:space="preserve">app.py</w:t>
+      </w:r>
+      <w:r>
+        <w:t xml:space="preserve">)</w:t>
+      </w:r>
+    </w:p>
+    <w:p>
+      <w:pPr>
+        <w:pStyle w:val="FirstParagraph"/>
+      </w:pPr>
+      <w:r>
+        <w:t xml:space="preserve">L’interface Streamlit moderne et interactive permet :</w:t>
+      </w:r>
+    </w:p>
+    <w:p>
+      <w:pPr>
+        <w:pStyle w:val="Compact"/>
+        <w:numPr>
+          <w:ilvl w:val="0"/>
+          <w:numId w:val="1030"/>
+        </w:numPr>
+      </w:pPr>
+      <w:r>
+        <w:rPr>
+          <w:b/>
+          <w:bCs/>
+        </w:rPr>
+        <w:t xml:space="preserve">Chargement du modèle</w:t>
+      </w:r>
+      <w:r>
+        <w:t xml:space="preserve"> </w:t>
+      </w:r>
+      <w:r>
+        <w:t xml:space="preserve">: Sélection d’un modèle entraîné dans la barre latérale</w:t>
+      </w:r>
+    </w:p>
+    <w:p>
+      <w:pPr>
+        <w:pStyle w:val="Compact"/>
+        <w:numPr>
+          <w:ilvl w:val="0"/>
+          <w:numId w:val="1030"/>
+        </w:numPr>
+      </w:pPr>
+      <w:r>
+        <w:rPr>
+          <w:b/>
+          <w:bCs/>
+        </w:rPr>
+        <w:t xml:space="preserve">Upload de données</w:t>
+      </w:r>
+      <w:r>
+        <w:t xml:space="preserve"> </w:t>
+      </w:r>
+      <w:r>
+        <w:t xml:space="preserve">: Import d’un fichier CSV via</w:t>
+      </w:r>
+      <w:r>
+        <w:t xml:space="preserve"> </w:t>
       </w:r>
       <w:r>
         <w:rPr>
           <w:rStyle w:val="VerbatimChar"/>
         </w:rPr>
-        <w:t xml:space="preserve">                               ↓</w:t>
-      </w:r>
-      <w:r>
-        <w:br/>
+        <w:t xml:space="preserve">st.file_uploader</w:t>
+      </w:r>
+    </w:p>
+    <w:p>
+      <w:pPr>
+        <w:pStyle w:val="Compact"/>
+        <w:numPr>
+          <w:ilvl w:val="0"/>
+          <w:numId w:val="1030"/>
+        </w:numPr>
+      </w:pPr>
+      <w:r>
+        <w:rPr>
+          <w:b/>
+          <w:bCs/>
+        </w:rPr>
+        <w:t xml:space="preserve">Prédiction</w:t>
+      </w:r>
+      <w:r>
+        <w:t xml:space="preserve"> </w:t>
+      </w:r>
+      <w:r>
+        <w:t xml:space="preserve">: Détection avec affichage codé par couleur (vert = normal, rouge = attaque)</w:t>
+      </w:r>
+    </w:p>
+    <w:p>
+      <w:pPr>
+        <w:pStyle w:val="Compact"/>
+        <w:numPr>
+          <w:ilvl w:val="0"/>
+          <w:numId w:val="1030"/>
+        </w:numPr>
+      </w:pPr>
+      <w:r>
+        <w:rPr>
+          <w:b/>
+          <w:bCs/>
+        </w:rPr>
+        <w:t xml:space="preserve">Performances</w:t>
+      </w:r>
+      <w:r>
+        <w:t xml:space="preserve"> </w:t>
+      </w:r>
+      <w:r>
+        <w:t xml:space="preserve">: Affichage automatique des métriques si le fichier contient une colonne label</w:t>
+      </w:r>
+    </w:p>
+    <w:p>
+      <w:pPr>
+        <w:pStyle w:val="Compact"/>
+        <w:numPr>
+          <w:ilvl w:val="0"/>
+          <w:numId w:val="1030"/>
+        </w:numPr>
+      </w:pPr>
+      <w:r>
+        <w:rPr>
+          <w:b/>
+          <w:bCs/>
+        </w:rPr>
+        <w:t xml:space="preserve">Graphiques</w:t>
+      </w:r>
+      <w:r>
+        <w:t xml:space="preserve"> </w:t>
+      </w:r>
+      <w:r>
+        <w:t xml:space="preserve">: Distribution des prédictions, importance des caractéristiques, matrice de confusion</w:t>
+      </w:r>
+    </w:p>
+    <w:p>
+      <w:pPr>
+        <w:pStyle w:val="Compact"/>
+        <w:numPr>
+          <w:ilvl w:val="0"/>
+          <w:numId w:val="1030"/>
+        </w:numPr>
+      </w:pPr>
+      <w:r>
+        <w:rPr>
+          <w:b/>
+          <w:bCs/>
+        </w:rPr>
+        <w:t xml:space="preserve">Export</w:t>
+      </w:r>
+      <w:r>
+        <w:t xml:space="preserve"> </w:t>
+      </w:r>
+      <w:r>
+        <w:t xml:space="preserve">: Téléchargement des résultats en CSV</w:t>
+      </w:r>
+    </w:p>
+    <w:bookmarkEnd w:id="108"/>
+    <w:bookmarkStart w:id="109" w:name="script-de-démonstration-demo.py"/>
+    <w:p>
+      <w:pPr>
+        <w:pStyle w:val="Heading3"/>
+      </w:pPr>
+      <w:r>
+        <w:t xml:space="preserve">Script de démonstration (</w:t>
       </w:r>
       <w:r>
         <w:rPr>
           <w:rStyle w:val="VerbatimChar"/>
         </w:rPr>
-        <w:t xml:space="preserve">                    ┌──────────────────────┐</w:t>
-      </w:r>
-      <w:r>
-        <w:br/>
+        <w:t xml:space="preserve">demo.py</w:t>
+      </w:r>
+      <w:r>
+        <w:t xml:space="preserve">)</w:t>
+      </w:r>
+    </w:p>
+    <w:p>
+      <w:pPr>
+        <w:pStyle w:val="FirstParagraph"/>
+      </w:pPr>
+      <w:r>
+        <w:t xml:space="preserve">Le script</w:t>
+      </w:r>
+      <w:r>
+        <w:t xml:space="preserve"> </w:t>
       </w:r>
       <w:r>
         <w:rPr>
           <w:rStyle w:val="VerbatimChar"/>
         </w:rPr>
-        <w:t xml:space="preserve">                    │    Prétraitement     │</w:t>
-      </w:r>
-      <w:r>
-        <w:br/>
-      </w:r>
+        <w:t xml:space="preserve">demo.py</w:t>
+      </w:r>
+      <w:r>
+        <w:t xml:space="preserve"> </w:t>
+      </w:r>
+      <w:r>
+        <w:t xml:space="preserve">génère rapidement un dataset synthétique et entraîne un modèle pour une démonstration rapide :</w:t>
+      </w:r>
+    </w:p>
+    <w:p>
+      <w:pPr>
+        <w:pStyle w:val="SourceCode"/>
+      </w:pPr>
       <w:r>
         <w:rPr>
           <w:rStyle w:val="VerbatimChar"/>
         </w:rPr>
-        <w:t xml:space="preserve">                    │  - Normalisation     │</w:t>
-      </w:r>
-      <w:r>
-        <w:br/>
+        <w:t xml:space="preserve">python demo.py</w:t>
+      </w:r>
+    </w:p>
+    <w:bookmarkEnd w:id="109"/>
+    <w:bookmarkStart w:id="110" w:name="X30fec73ec82dd3f08d87a337ee4446c90b1a2e5"/>
+    <w:p>
+      <w:pPr>
+        <w:pStyle w:val="Heading3"/>
+      </w:pPr>
+      <w:r>
+        <w:t xml:space="preserve">Génération des graphiques (</w:t>
       </w:r>
       <w:r>
         <w:rPr>
           <w:rStyle w:val="VerbatimChar"/>
         </w:rPr>
-        <w:t xml:space="preserve">                    │  - Encodage          │</w:t>
-      </w:r>
-      <w:r>
-        <w:br/>
-      </w:r>
+        <w:t xml:space="preserve">generate_graphiques.py</w:t>
+      </w:r>
+      <w:r>
+        <w:t xml:space="preserve">)</w:t>
+      </w:r>
+    </w:p>
+    <w:p>
+      <w:pPr>
+        <w:pStyle w:val="FirstParagraph"/>
+      </w:pPr>
+      <w:r>
+        <w:t xml:space="preserve">Ce script génère automatiquement les 10 graphiques nécessaires au mémoire :</w:t>
+      </w:r>
+    </w:p>
+    <w:p>
+      <w:pPr>
+        <w:pStyle w:val="SourceCode"/>
+      </w:pPr>
       <w:r>
         <w:rPr>
           <w:rStyle w:val="VerbatimChar"/>
         </w:rPr>
-        <w:t xml:space="preserve">                    └──────────┬───────────┘</w:t>
-      </w:r>
-      <w:r>
-        <w:br/>
+        <w:t xml:space="preserve">python generate_graphiques.py</w:t>
+      </w:r>
+    </w:p>
+    <w:p>
+      <w:pPr>
+        <w:pStyle w:val="FirstParagraph"/>
+      </w:pPr>
+      <w:r>
+        <w:t xml:space="preserve">Les graphiques sont sauvegardés dans</w:t>
+      </w:r>
+      <w:r>
+        <w:t xml:space="preserve"> </w:t>
       </w:r>
       <w:r>
         <w:rPr>
           <w:rStyle w:val="VerbatimChar"/>
         </w:rPr>
-        <w:t xml:space="preserve">                               ↓</w:t>
-      </w:r>
-      <w:r>
-        <w:br/>
-      </w:r>
-      <w:r>
-        <w:rPr>
-          <w:rStyle w:val="VerbatimChar"/>
-        </w:rPr>
-        <w:t xml:space="preserve">                    ┌──────────────────────┐</w:t>
-      </w:r>
-      <w:r>
-        <w:br/>
-      </w:r>
-      <w:r>
-        <w:rPr>
-          <w:rStyle w:val="VerbatimChar"/>
-        </w:rPr>
-        <w:t xml:space="preserve">                    │  Sélection variables │</w:t>
-      </w:r>
-      <w:r>
-        <w:br/>
-      </w:r>
-      <w:r>
-        <w:rPr>
-          <w:rStyle w:val="VerbatimChar"/>
-        </w:rPr>
-        <w:t xml:space="preserve">                    │  - ANOVA F-test      │</w:t>
-      </w:r>
-      <w:r>
-        <w:br/>
-      </w:r>
-      <w:r>
-        <w:rPr>
-          <w:rStyle w:val="VerbatimChar"/>
-        </w:rPr>
-        <w:t xml:space="preserve">                    │  - Feature selection │</w:t>
-      </w:r>
-      <w:r>
-        <w:br/>
-      </w:r>
-      <w:r>
-        <w:rPr>
-          <w:rStyle w:val="VerbatimChar"/>
-        </w:rPr>
-        <w:t xml:space="preserve">                    └──────────┬───────────┘</w:t>
-      </w:r>
-      <w:r>
-        <w:br/>
-      </w:r>
-      <w:r>
-        <w:rPr>
-          <w:rStyle w:val="VerbatimChar"/>
-        </w:rPr>
-        <w:t xml:space="preserve">                               ↓</w:t>
-      </w:r>
-      <w:r>
-        <w:br/>
-      </w:r>
-      <w:r>
-        <w:rPr>
-          <w:rStyle w:val="VerbatimChar"/>
-        </w:rPr>
-        <w:t xml:space="preserve">                    ┌──────────────────────┐</w:t>
-      </w:r>
-      <w:r>
-        <w:br/>
-      </w:r>
-      <w:r>
-        <w:rPr>
-          <w:rStyle w:val="VerbatimChar"/>
-        </w:rPr>
-        <w:t xml:space="preserve">                    │    Entraînement      │</w:t>
-      </w:r>
-      <w:r>
-        <w:br/>
-      </w:r>
-      <w:r>
-        <w:rPr>
-          <w:rStyle w:val="VerbatimChar"/>
-        </w:rPr>
-        <w:t xml:space="preserve">                    │  - 6 modèles ML      │</w:t>
-      </w:r>
-      <w:r>
-        <w:br/>
-      </w:r>
-      <w:r>
-        <w:rPr>
-          <w:rStyle w:val="VerbatimChar"/>
-        </w:rPr>
-        <w:t xml:space="preserve">                    │  - Fit sur X_train   │</w:t>
-      </w:r>
-      <w:r>
-        <w:br/>
-      </w:r>
-      <w:r>
-        <w:rPr>
-          <w:rStyle w:val="VerbatimChar"/>
-        </w:rPr>
-        <w:t xml:space="preserve">                    └──────────┬───────────┘</w:t>
-      </w:r>
-      <w:r>
-        <w:br/>
-      </w:r>
-      <w:r>
-        <w:rPr>
-          <w:rStyle w:val="VerbatimChar"/>
-        </w:rPr>
-        <w:t xml:space="preserve">                               ↓</w:t>
-      </w:r>
-      <w:r>
-        <w:br/>
-      </w:r>
-      <w:r>
-        <w:rPr>
-          <w:rStyle w:val="VerbatimChar"/>
-        </w:rPr>
-        <w:t xml:space="preserve">                    ┌──────────────────────┐</w:t>
-      </w:r>
-      <w:r>
-        <w:br/>
-      </w:r>
-      <w:r>
-        <w:rPr>
-          <w:rStyle w:val="VerbatimChar"/>
-        </w:rPr>
-        <w:t xml:space="preserve">                    │     Prédiction       │</w:t>
-      </w:r>
-      <w:r>
-        <w:br/>
-      </w:r>
-      <w:r>
-        <w:rPr>
-          <w:rStyle w:val="VerbatimChar"/>
-        </w:rPr>
-        <w:t xml:space="preserve">                    │  - Predict sur X_test│</w:t>
-      </w:r>
-      <w:r>
-        <w:br/>
-      </w:r>
-      <w:r>
-        <w:rPr>
-          <w:rStyle w:val="VerbatimChar"/>
-        </w:rPr>
-        <w:t xml:space="preserve">                    │  - Probabilités      │</w:t>
-      </w:r>
-      <w:r>
-        <w:br/>
-      </w:r>
-      <w:r>
-        <w:rPr>
-          <w:rStyle w:val="VerbatimChar"/>
-        </w:rPr>
-        <w:t xml:space="preserve">                    └──────────┬───────────┘</w:t>
-      </w:r>
-      <w:r>
-        <w:br/>
-      </w:r>
-      <w:r>
-        <w:rPr>
-          <w:rStyle w:val="VerbatimChar"/>
-        </w:rPr>
-        <w:t xml:space="preserve">                               ↓</w:t>
-      </w:r>
-      <w:r>
-        <w:br/>
-      </w:r>
-      <w:r>
-        <w:rPr>
-          <w:rStyle w:val="VerbatimChar"/>
-        </w:rPr>
-        <w:t xml:space="preserve">                    ┌──────────────────────┐</w:t>
-      </w:r>
-      <w:r>
-        <w:br/>
-      </w:r>
-      <w:r>
-        <w:rPr>
-          <w:rStyle w:val="VerbatimChar"/>
-        </w:rPr>
-        <w:t xml:space="preserve">                    │     Évaluation       │</w:t>
-      </w:r>
-      <w:r>
-        <w:br/>
-      </w:r>
-      <w:r>
-        <w:rPr>
-          <w:rStyle w:val="VerbatimChar"/>
-        </w:rPr>
-        <w:t xml:space="preserve">                    │  - Métriques         │</w:t>
-      </w:r>
-      <w:r>
-        <w:br/>
-      </w:r>
-      <w:r>
-        <w:rPr>
-          <w:rStyle w:val="VerbatimChar"/>
-        </w:rPr>
-        <w:t xml:space="preserve">                    │  - Matrice confusion │</w:t>
-      </w:r>
-      <w:r>
-        <w:br/>
-      </w:r>
-      <w:r>
-        <w:rPr>
-          <w:rStyle w:val="VerbatimChar"/>
-        </w:rPr>
-        <w:t xml:space="preserve">                    │  - Courbes ROC       │</w:t>
-      </w:r>
-      <w:r>
-        <w:br/>
-      </w:r>
-      <w:r>
-        <w:rPr>
-          <w:rStyle w:val="VerbatimChar"/>
-        </w:rPr>
-        <w:t xml:space="preserve">                    └──────────────────────┘</w:t>
-      </w:r>
-    </w:p>
-    <w:bookmarkStart w:id="95" w:name="X5ef923b4054e40aa46cdf90d594fb8b469afca4"/>
-    <w:p>
-      <w:pPr>
-        <w:pStyle w:val="Heading3"/>
-      </w:pPr>
-      <w:r>
-        <w:t xml:space="preserve">Détail du pipeline d’entraînement (</w:t>
-      </w:r>
-      <w:r>
-        <w:rPr>
-          <w:rStyle w:val="VerbatimChar"/>
-        </w:rPr>
-        <w:t xml:space="preserve">train.py</w:t>
-      </w:r>
-      <w:r>
-        <w:t xml:space="preserve">)</w:t>
-      </w:r>
-    </w:p>
-    <w:p>
-      <w:pPr>
-        <w:pStyle w:val="FirstParagraph"/>
-      </w:pPr>
-      <w:r>
-        <w:t xml:space="preserve">Le script</w:t>
-      </w:r>
-      <w:r>
-        <w:t xml:space="preserve"> </w:t>
-      </w:r>
-      <w:r>
-        <w:rPr>
-          <w:rStyle w:val="VerbatimChar"/>
-        </w:rPr>
-        <w:t xml:space="preserve">train.py</w:t>
-      </w:r>
-      <w:r>
-        <w:t xml:space="preserve"> </w:t>
-      </w:r>
-      <w:r>
-        <w:t xml:space="preserve">orchestre l’ensemble du pipeline d’entraînement :</w:t>
-      </w:r>
-    </w:p>
-    <w:p>
-      <w:pPr>
-        <w:pStyle w:val="Compact"/>
-        <w:numPr>
-          <w:ilvl w:val="0"/>
-          <w:numId w:val="1029"/>
-        </w:numPr>
-      </w:pPr>
-      <w:r>
-        <w:rPr>
-          <w:b/>
-          <w:bCs/>
-        </w:rPr>
-        <w:t xml:space="preserve">Chargement du dataset</w:t>
-      </w:r>
-      <w:r>
-        <w:t xml:space="preserve"> </w:t>
-      </w:r>
-      <w:r>
-        <w:t xml:space="preserve">: Lit le fichier CSV et extrait les colonnes pertinentes</w:t>
-      </w:r>
-    </w:p>
-    <w:p>
-      <w:pPr>
-        <w:pStyle w:val="Compact"/>
-        <w:numPr>
-          <w:ilvl w:val="0"/>
-          <w:numId w:val="1029"/>
-        </w:numPr>
-      </w:pPr>
-      <w:r>
-        <w:rPr>
-          <w:b/>
-          <w:bCs/>
-        </w:rPr>
-        <w:t xml:space="preserve">Exécution du pipeline de prétraitement</w:t>
-      </w:r>
-      <w:r>
-        <w:t xml:space="preserve"> </w:t>
-      </w:r>
-      <w:r>
-        <w:t xml:space="preserve">: Nettoie, normalise et sépare les données</w:t>
-      </w:r>
-    </w:p>
-    <w:p>
-      <w:pPr>
-        <w:pStyle w:val="Compact"/>
-        <w:numPr>
-          <w:ilvl w:val="0"/>
-          <w:numId w:val="1029"/>
-        </w:numPr>
-      </w:pPr>
-      <w:r>
-        <w:rPr>
-          <w:b/>
-          <w:bCs/>
-        </w:rPr>
-        <w:t xml:space="preserve">Entraînement des 6 modèles</w:t>
-      </w:r>
-      <w:r>
-        <w:t xml:space="preserve"> </w:t>
-      </w:r>
-      <w:r>
-        <w:t xml:space="preserve">: Chaque modèle est entraîné avec chronométrage</w:t>
-      </w:r>
-    </w:p>
-    <w:p>
-      <w:pPr>
-        <w:pStyle w:val="Compact"/>
-        <w:numPr>
-          <w:ilvl w:val="0"/>
-          <w:numId w:val="1029"/>
-        </w:numPr>
-      </w:pPr>
-      <w:r>
-        <w:rPr>
-          <w:b/>
-          <w:bCs/>
-        </w:rPr>
-        <w:t xml:space="preserve">Évaluation</w:t>
-      </w:r>
-      <w:r>
-        <w:t xml:space="preserve"> </w:t>
-      </w:r>
-      <w:r>
-        <w:t xml:space="preserve">: Calcul de toutes les métriques (accuracy, précision, rappel, F1, matrice)</w:t>
-      </w:r>
-    </w:p>
-    <w:p>
-      <w:pPr>
-        <w:pStyle w:val="Compact"/>
-        <w:numPr>
-          <w:ilvl w:val="0"/>
-          <w:numId w:val="1029"/>
-        </w:numPr>
-      </w:pPr>
-      <w:r>
-        <w:rPr>
-          <w:b/>
-          <w:bCs/>
-        </w:rPr>
-        <w:t xml:space="preserve">Comparaison</w:t>
-      </w:r>
-      <w:r>
-        <w:t xml:space="preserve"> </w:t>
-      </w:r>
-      <w:r>
-        <w:t xml:space="preserve">: Classement des modèles par F1-Score avec tableau formaté</w:t>
-      </w:r>
-    </w:p>
-    <w:p>
-      <w:pPr>
-        <w:pStyle w:val="Compact"/>
-        <w:numPr>
-          <w:ilvl w:val="0"/>
-          <w:numId w:val="1029"/>
-        </w:numPr>
-      </w:pPr>
-      <w:r>
-        <w:rPr>
-          <w:b/>
-          <w:bCs/>
-        </w:rPr>
-        <w:t xml:space="preserve">Sauvegarde</w:t>
-      </w:r>
-      <w:r>
-        <w:t xml:space="preserve"> </w:t>
-      </w:r>
-      <w:r>
-        <w:t xml:space="preserve">: Meilleur modèle et rapport d’entraînement sauvegardés dans</w:t>
-      </w:r>
-      <w:r>
-        <w:t xml:space="preserve"> </w:t>
-      </w:r>
-      <w:r>
-        <w:rPr>
-          <w:rStyle w:val="VerbatimChar"/>
-        </w:rPr>
-        <w:t xml:space="preserve">data/processed/</w:t>
-      </w:r>
-    </w:p>
-    <w:bookmarkEnd w:id="95"/>
-    <w:bookmarkStart w:id="96" w:name="gestion-des-erreurs"/>
-    <w:p>
-      <w:pPr>
-        <w:pStyle w:val="Heading3"/>
-      </w:pPr>
-      <w:r>
-        <w:t xml:space="preserve">Gestion des erreurs</w:t>
-      </w:r>
-    </w:p>
-    <w:p>
-      <w:pPr>
-        <w:pStyle w:val="FirstParagraph"/>
-      </w:pPr>
-      <w:r>
-        <w:t xml:space="preserve">Le système inclut une gestion complète des erreurs :</w:t>
-      </w:r>
-      <w:r>
-        <w:t xml:space="preserve"> </w:t>
-      </w:r>
-      <w:r>
-        <w:t xml:space="preserve">- Détection et rapport des colonnes manquantes</w:t>
-      </w:r>
-      <w:r>
-        <w:t xml:space="preserve"> </w:t>
-      </w:r>
-      <w:r>
-        <w:t xml:space="preserve">- Gestion des valeurs aberrantes (NaN, Inf)</w:t>
-      </w:r>
-      <w:r>
-        <w:t xml:space="preserve"> </w:t>
-      </w:r>
-      <w:r>
-        <w:t xml:space="preserve">- Messages d’erreur explicites en cas d’échec</w:t>
-      </w:r>
-      <w:r>
-        <w:t xml:space="preserve"> </w:t>
-      </w:r>
-      <w:r>
-        <w:t xml:space="preserve">- Journalisation (logging) de toutes les étapes</w:t>
-      </w:r>
-    </w:p>
-    <w:bookmarkEnd w:id="96"/>
-    <w:bookmarkEnd w:id="97"/>
-    <w:bookmarkStart w:id="102" w:name="interface-utilisateur"/>
-    <w:p>
-      <w:pPr>
-        <w:pStyle w:val="Heading2"/>
-      </w:pPr>
-      <w:r>
-        <w:t xml:space="preserve">5.4 Interface utilisateur</w:t>
-      </w:r>
-    </w:p>
-    <w:bookmarkStart w:id="98" w:name="interface-en-ligne-de-commande-cli"/>
-    <w:p>
-      <w:pPr>
-        <w:pStyle w:val="Heading3"/>
-      </w:pPr>
-      <w:r>
-        <w:t xml:space="preserve">Interface en ligne de commande (CLI)</w:t>
-      </w:r>
-    </w:p>
-    <w:p>
-      <w:pPr>
-        <w:pStyle w:val="FirstParagraph"/>
-      </w:pPr>
-      <w:r>
-        <w:t xml:space="preserve">L’interface CLI (</w:t>
-      </w:r>
-      <w:r>
-        <w:rPr>
-          <w:rStyle w:val="VerbatimChar"/>
-        </w:rPr>
-        <w:t xml:space="preserve">main.py</w:t>
-      </w:r>
-      <w:r>
-        <w:t xml:space="preserve">) permet d’exécuter le pipeline complet depuis le terminal :</w:t>
-      </w:r>
-    </w:p>
-    <w:p>
-      <w:pPr>
-        <w:pStyle w:val="SourceCode"/>
-      </w:pPr>
-      <w:r>
-        <w:rPr>
-          <w:rStyle w:val="VerbatimChar"/>
-        </w:rPr>
-        <w:t xml:space="preserve"># Pipeline complet avec le modèle par défaut (Random Forest)</w:t>
-      </w:r>
-      <w:r>
-        <w:br/>
-      </w:r>
-      <w:r>
-        <w:rPr>
-          <w:rStyle w:val="VerbatimChar"/>
-        </w:rPr>
-        <w:t xml:space="preserve">python main.py</w:t>
-      </w:r>
-      <w:r>
-        <w:br/>
-      </w:r>
-      <w:r>
-        <w:br/>
-      </w:r>
-      <w:r>
-        <w:rPr>
-          <w:rStyle w:val="VerbatimChar"/>
-        </w:rPr>
-        <w:t xml:space="preserve"># Utiliser un modèle spécifique</w:t>
-      </w:r>
-      <w:r>
-        <w:br/>
-      </w:r>
-      <w:r>
-        <w:rPr>
-          <w:rStyle w:val="VerbatimChar"/>
-        </w:rPr>
-        <w:t xml:space="preserve">python main.py --modele svm</w:t>
-      </w:r>
-      <w:r>
-        <w:br/>
-      </w:r>
-      <w:r>
-        <w:br/>
-      </w:r>
-      <w:r>
-        <w:rPr>
-          <w:rStyle w:val="VerbatimChar"/>
-        </w:rPr>
-        <w:t xml:space="preserve"># Utiliser le dataset CICIDS2017</w:t>
-      </w:r>
-      <w:r>
-        <w:br/>
-      </w:r>
-      <w:r>
-        <w:rPr>
-          <w:rStyle w:val="VerbatimChar"/>
-        </w:rPr>
-        <w:t xml:space="preserve">python main.py --dataset cicids2017</w:t>
-      </w:r>
-      <w:r>
-        <w:br/>
-      </w:r>
-      <w:r>
-        <w:br/>
-      </w:r>
-      <w:r>
-        <w:rPr>
-          <w:rStyle w:val="VerbatimChar"/>
-        </w:rPr>
-        <w:t xml:space="preserve"># Comparer tous les modèles</w:t>
-      </w:r>
-      <w:r>
-        <w:br/>
-      </w:r>
-      <w:r>
-        <w:rPr>
-          <w:rStyle w:val="VerbatimChar"/>
-        </w:rPr>
-        <w:t xml:space="preserve">python main.py --compare</w:t>
-      </w:r>
-    </w:p>
-    <w:bookmarkEnd w:id="98"/>
-    <w:bookmarkStart w:id="99" w:name="interface-web-streamlit-app.py"/>
-    <w:p>
-      <w:pPr>
-        <w:pStyle w:val="Heading3"/>
-      </w:pPr>
-      <w:r>
-        <w:t xml:space="preserve">Interface web Streamlit (</w:t>
-      </w:r>
-      <w:r>
-        <w:rPr>
-          <w:rStyle w:val="VerbatimChar"/>
-        </w:rPr>
-        <w:t xml:space="preserve">app.py</w:t>
-      </w:r>
-      <w:r>
-        <w:t xml:space="preserve">)</w:t>
-      </w:r>
-    </w:p>
-    <w:p>
-      <w:pPr>
-        <w:pStyle w:val="FirstParagraph"/>
-      </w:pPr>
-      <w:r>
-        <w:t xml:space="preserve">L’interface Streamlit moderne et interactive permet :</w:t>
-      </w:r>
-    </w:p>
-    <w:p>
-      <w:pPr>
-        <w:pStyle w:val="Compact"/>
-        <w:numPr>
-          <w:ilvl w:val="0"/>
-          <w:numId w:val="1030"/>
-        </w:numPr>
-      </w:pPr>
-      <w:r>
-        <w:rPr>
-          <w:b/>
-          <w:bCs/>
-        </w:rPr>
-        <w:t xml:space="preserve">Chargement du modèle</w:t>
-      </w:r>
-      <w:r>
-        <w:t xml:space="preserve"> </w:t>
-      </w:r>
-      <w:r>
-        <w:t xml:space="preserve">: Sélection d’un modèle entraîné dans la barre latérale</w:t>
-      </w:r>
-    </w:p>
-    <w:p>
-      <w:pPr>
-        <w:pStyle w:val="Compact"/>
-        <w:numPr>
-          <w:ilvl w:val="0"/>
-          <w:numId w:val="1030"/>
-        </w:numPr>
-      </w:pPr>
-      <w:r>
-        <w:rPr>
-          <w:b/>
-          <w:bCs/>
-        </w:rPr>
-        <w:t xml:space="preserve">Upload de données</w:t>
-      </w:r>
-      <w:r>
-        <w:t xml:space="preserve"> </w:t>
-      </w:r>
-      <w:r>
-        <w:t xml:space="preserve">: Import d’un fichier CSV via</w:t>
-      </w:r>
-      <w:r>
-        <w:t xml:space="preserve"> </w:t>
-      </w:r>
-      <w:r>
-        <w:rPr>
-          <w:rStyle w:val="VerbatimChar"/>
-        </w:rPr>
-        <w:t xml:space="preserve">st.file_uploader</w:t>
-      </w:r>
-    </w:p>
-    <w:p>
-      <w:pPr>
-        <w:pStyle w:val="Compact"/>
-        <w:numPr>
-          <w:ilvl w:val="0"/>
-          <w:numId w:val="1030"/>
-        </w:numPr>
-      </w:pPr>
-      <w:r>
-        <w:rPr>
-          <w:b/>
-          <w:bCs/>
-        </w:rPr>
-        <w:t xml:space="preserve">Prédiction</w:t>
-      </w:r>
-      <w:r>
-        <w:t xml:space="preserve"> </w:t>
-      </w:r>
-      <w:r>
-        <w:t xml:space="preserve">: Détection avec affichage codé par couleur (vert = normal, rouge = attaque)</w:t>
-      </w:r>
-    </w:p>
-    <w:p>
-      <w:pPr>
-        <w:pStyle w:val="Compact"/>
-        <w:numPr>
-          <w:ilvl w:val="0"/>
-          <w:numId w:val="1030"/>
-        </w:numPr>
-      </w:pPr>
-      <w:r>
-        <w:rPr>
-          <w:b/>
-          <w:bCs/>
-        </w:rPr>
-        <w:t xml:space="preserve">Performances</w:t>
-      </w:r>
-      <w:r>
-        <w:t xml:space="preserve"> </w:t>
-      </w:r>
-      <w:r>
-        <w:t xml:space="preserve">: Affichage automatique des métriques si le fichier contient une colonne label</w:t>
-      </w:r>
-    </w:p>
-    <w:p>
-      <w:pPr>
-        <w:pStyle w:val="Compact"/>
-        <w:numPr>
-          <w:ilvl w:val="0"/>
-          <w:numId w:val="1030"/>
-        </w:numPr>
-      </w:pPr>
-      <w:r>
-        <w:rPr>
-          <w:b/>
-          <w:bCs/>
-        </w:rPr>
-        <w:t xml:space="preserve">Graphiques</w:t>
-      </w:r>
-      <w:r>
-        <w:t xml:space="preserve"> </w:t>
-      </w:r>
-      <w:r>
-        <w:t xml:space="preserve">: Distribution des prédictions, importance des caractéristiques, matrice de confusion</w:t>
-      </w:r>
-    </w:p>
-    <w:p>
-      <w:pPr>
-        <w:pStyle w:val="Compact"/>
-        <w:numPr>
-          <w:ilvl w:val="0"/>
-          <w:numId w:val="1030"/>
-        </w:numPr>
-      </w:pPr>
-      <w:r>
-        <w:rPr>
-          <w:b/>
-          <w:bCs/>
-        </w:rPr>
-        <w:t xml:space="preserve">Export</w:t>
-      </w:r>
-      <w:r>
-        <w:t xml:space="preserve"> </w:t>
-      </w:r>
-      <w:r>
-        <w:t xml:space="preserve">: Téléchargement des résultats en CSV</w:t>
-      </w:r>
-    </w:p>
-    <w:bookmarkEnd w:id="99"/>
-    <w:bookmarkStart w:id="100" w:name="script-de-démonstration-demo.py"/>
-    <w:p>
-      <w:pPr>
-        <w:pStyle w:val="Heading3"/>
-      </w:pPr>
-      <w:r>
-        <w:t xml:space="preserve">Script de démonstration (</w:t>
-      </w:r>
-      <w:r>
-        <w:rPr>
-          <w:rStyle w:val="VerbatimChar"/>
-        </w:rPr>
-        <w:t xml:space="preserve">demo.py</w:t>
-      </w:r>
-      <w:r>
-        <w:t xml:space="preserve">)</w:t>
-      </w:r>
-    </w:p>
-    <w:p>
-      <w:pPr>
-        <w:pStyle w:val="FirstParagraph"/>
-      </w:pPr>
-      <w:r>
-        <w:t xml:space="preserve">Le script</w:t>
-      </w:r>
-      <w:r>
-        <w:t xml:space="preserve"> </w:t>
-      </w:r>
-      <w:r>
-        <w:rPr>
-          <w:rStyle w:val="VerbatimChar"/>
-        </w:rPr>
-        <w:t xml:space="preserve">demo.py</w:t>
-      </w:r>
-      <w:r>
-        <w:t xml:space="preserve"> </w:t>
-      </w:r>
-      <w:r>
-        <w:t xml:space="preserve">génère rapidement un dataset synthétique et entraîne un modèle pour une démonstration rapide :</w:t>
-      </w:r>
-    </w:p>
-    <w:p>
-      <w:pPr>
-        <w:pStyle w:val="SourceCode"/>
-      </w:pPr>
-      <w:r>
-        <w:rPr>
-          <w:rStyle w:val="VerbatimChar"/>
-        </w:rPr>
-        <w:t xml:space="preserve">python demo.py</w:t>
-      </w:r>
-    </w:p>
-    <w:bookmarkEnd w:id="100"/>
-    <w:bookmarkStart w:id="101" w:name="X30fec73ec82dd3f08d87a337ee4446c90b1a2e5"/>
-    <w:p>
-      <w:pPr>
-        <w:pStyle w:val="Heading3"/>
-      </w:pPr>
-      <w:r>
-        <w:t xml:space="preserve">Génération des graphiques (</w:t>
-      </w:r>
-      <w:r>
-        <w:rPr>
-          <w:rStyle w:val="VerbatimChar"/>
-        </w:rPr>
-        <w:t xml:space="preserve">generate_graphiques.py</w:t>
-      </w:r>
-      <w:r>
-        <w:t xml:space="preserve">)</w:t>
-      </w:r>
-    </w:p>
-    <w:p>
-      <w:pPr>
-        <w:pStyle w:val="FirstParagraph"/>
-      </w:pPr>
-      <w:r>
-        <w:t xml:space="preserve">Ce script génère automatiquement les 10 graphiques nécessaires au mémoire :</w:t>
-      </w:r>
-    </w:p>
-    <w:p>
-      <w:pPr>
-        <w:pStyle w:val="SourceCode"/>
-      </w:pPr>
-      <w:r>
-        <w:rPr>
-          <w:rStyle w:val="VerbatimChar"/>
-        </w:rPr>
-        <w:t xml:space="preserve">python generate_graphiques.py</w:t>
-      </w:r>
-    </w:p>
-    <w:p>
-      <w:pPr>
-        <w:pStyle w:val="FirstParagraph"/>
-      </w:pPr>
-      <w:r>
-        <w:t xml:space="preserve">Les graphiques sont sauvegardés dans</w:t>
-      </w:r>
-      <w:r>
-        <w:t xml:space="preserve"> </w:t>
-      </w:r>
-      <w:r>
-        <w:rPr>
-          <w:rStyle w:val="VerbatimChar"/>
-        </w:rPr>
         <w:t xml:space="preserve">data/processed/graphiques/</w:t>
       </w:r>
       <w:r>
@@ -8905,10 +9106,22 @@
       <w:r>
         <w:t xml:space="preserve">10. Tableau comparatif</w:t>
       </w:r>
-    </w:p>
-    <w:bookmarkEnd w:id="101"/>
-    <w:bookmarkEnd w:id="102"/>
-    <w:bookmarkStart w:id="103" w:name="tests-unitaires"/>
+      <w:r>
+        <w:t xml:space="preserve"> </w:t>
+      </w:r>
+      <w:r>
+        <w:t xml:space="preserve">11. Diagramme d’architecture du pipeline</w:t>
+      </w:r>
+      <w:r>
+        <w:t xml:space="preserve"> </w:t>
+      </w:r>
+      <w:r>
+        <w:t xml:space="preserve">12. Interface Streamlit (mockup)</w:t>
+      </w:r>
+    </w:p>
+    <w:bookmarkEnd w:id="110"/>
+    <w:bookmarkEnd w:id="111"/>
+    <w:bookmarkStart w:id="112" w:name="tests-unitaires"/>
     <w:p>
       <w:pPr>
         <w:pStyle w:val="Heading2"/>
@@ -9057,9 +9270,9 @@
         </w:pict>
       </w:r>
     </w:p>
-    <w:bookmarkEnd w:id="103"/>
-    <w:bookmarkEnd w:id="104"/>
-    <w:bookmarkStart w:id="140" w:name="chapitre-6-résultats"/>
+    <w:bookmarkEnd w:id="112"/>
+    <w:bookmarkEnd w:id="113"/>
+    <w:bookmarkStart w:id="149" w:name="chapitre-6-résultats"/>
     <w:p>
       <w:pPr>
         <w:pStyle w:val="Heading1"/>
@@ -9068,7 +9281,7 @@
         <w:t xml:space="preserve">Chapitre 6 : Résultats</w:t>
       </w:r>
     </w:p>
-    <w:bookmarkStart w:id="132" w:name="performances-des-modèles"/>
+    <w:bookmarkStart w:id="141" w:name="performances-des-modèles"/>
     <w:p>
       <w:pPr>
         <w:pStyle w:val="Heading2"/>
@@ -9085,7 +9298,7 @@
         <w:t xml:space="preserve">Les six modèles ont été entraînés et évalués sur le dataset synthétique (2000 échantillons, 30 caractéristiques). Les résultats sont présentés ci-dessous.</w:t>
       </w:r>
     </w:p>
-    <w:bookmarkStart w:id="108" w:name="tableau-comparatif-des-performances"/>
+    <w:bookmarkStart w:id="117" w:name="tableau-comparatif-des-performances"/>
     <w:p>
       <w:pPr>
         <w:pStyle w:val="Heading3"/>
@@ -9835,18 +10048,18 @@
           <wp:inline>
             <wp:extent cx="5334000" cy="1738044"/>
             <wp:effectExtent b="0" l="0" r="0" t="0"/>
-            <wp:docPr descr="Tableau comparatif" title="" id="106" name="Picture"/>
+            <wp:docPr descr="Tableau comparatif" title="" id="115" name="Picture"/>
             <a:graphic>
               <a:graphicData uri="http://schemas.openxmlformats.org/drawingml/2006/picture">
                 <pic:pic>
                   <pic:nvPicPr>
-                    <pic:cNvPr descr="../data/processed/graphiques/10_tableau_comparatif.png" id="107" name="Picture"/>
+                    <pic:cNvPr descr="../data/processed/graphiques/10_tableau_comparatif.png" id="116" name="Picture"/>
                     <pic:cNvPicPr>
                       <a:picLocks noChangeArrowheads="1" noChangeAspect="1"/>
                     </pic:cNvPicPr>
                   </pic:nvPicPr>
                   <pic:blipFill>
-                    <a:blip r:embed="rId105"/>
+                    <a:blip r:embed="rId114"/>
                     <a:stretch>
                       <a:fillRect/>
                     </a:stretch>
@@ -9893,8 +10106,8 @@
         <w:t xml:space="preserve">Graphique 6.1 : Tableau comparatif des 6 modèles classés par F1-Score</w:t>
       </w:r>
     </w:p>
-    <w:bookmarkEnd w:id="108"/>
-    <w:bookmarkStart w:id="112" w:name="analyse-détaillée-par-modèle"/>
+    <w:bookmarkEnd w:id="117"/>
+    <w:bookmarkStart w:id="121" w:name="analyse-détaillée-par-modèle"/>
     <w:p>
       <w:pPr>
         <w:pStyle w:val="Heading3"/>
@@ -10020,18 +10233,18 @@
           <wp:inline>
             <wp:extent cx="5334000" cy="2637033"/>
             <wp:effectExtent b="0" l="0" r="0" t="0"/>
-            <wp:docPr descr="Comparaison des métriques" title="" id="110" name="Picture"/>
+            <wp:docPr descr="Comparaison des métriques" title="" id="119" name="Picture"/>
             <a:graphic>
               <a:graphicData uri="http://schemas.openxmlformats.org/drawingml/2006/picture">
                 <pic:pic>
                   <pic:nvPicPr>
-                    <pic:cNvPr descr="../data/processed/graphiques/06_comparaison_metriques.png" id="111" name="Picture"/>
+                    <pic:cNvPr descr="../data/processed/graphiques/06_comparaison_metriques.png" id="120" name="Picture"/>
                     <pic:cNvPicPr>
                       <a:picLocks noChangeArrowheads="1" noChangeAspect="1"/>
                     </pic:cNvPicPr>
                   </pic:nvPicPr>
                   <pic:blipFill>
-                    <a:blip r:embed="rId109"/>
+                    <a:blip r:embed="rId118"/>
                     <a:stretch>
                       <a:fillRect/>
                     </a:stretch>
@@ -10078,8 +10291,8 @@
         <w:t xml:space="preserve">Graphique 6.2 : Comparaison des métriques (Accuracy, Précision, Rappel, F1-Score) par modèle</w:t>
       </w:r>
     </w:p>
-    <w:bookmarkEnd w:id="112"/>
-    <w:bookmarkStart w:id="116" w:name="temps-dentraînement"/>
+    <w:bookmarkEnd w:id="121"/>
+    <w:bookmarkStart w:id="125" w:name="temps-dentraînement"/>
     <w:p>
       <w:pPr>
         <w:pStyle w:val="Heading3"/>
@@ -10097,18 +10310,18 @@
           <wp:inline>
             <wp:extent cx="5334000" cy="2630959"/>
             <wp:effectExtent b="0" l="0" r="0" t="0"/>
-            <wp:docPr descr="Temps d’entraînement" title="" id="114" name="Picture"/>
+            <wp:docPr descr="Temps d’entraînement" title="" id="123" name="Picture"/>
             <a:graphic>
               <a:graphicData uri="http://schemas.openxmlformats.org/drawingml/2006/picture">
                 <pic:pic>
                   <pic:nvPicPr>
-                    <pic:cNvPr descr="../data/processed/graphiques/08_temps_entrainement.png" id="115" name="Picture"/>
+                    <pic:cNvPr descr="../data/processed/graphiques/08_temps_entrainement.png" id="124" name="Picture"/>
                     <pic:cNvPicPr>
                       <a:picLocks noChangeArrowheads="1" noChangeAspect="1"/>
                     </pic:cNvPicPr>
                   </pic:nvPicPr>
                   <pic:blipFill>
-                    <a:blip r:embed="rId113"/>
+                    <a:blip r:embed="rId122"/>
                     <a:stretch>
                       <a:fillRect/>
                     </a:stretch>
@@ -10193,8 +10406,8 @@
         <w:t xml:space="preserve">)</w:t>
       </w:r>
     </w:p>
-    <w:bookmarkEnd w:id="116"/>
-    <w:bookmarkStart w:id="120" w:name="matrice-de-confusion-du-meilleur-modèle"/>
+    <w:bookmarkEnd w:id="125"/>
+    <w:bookmarkStart w:id="129" w:name="matrice-de-confusion-du-meilleur-modèle"/>
     <w:p>
       <w:pPr>
         <w:pStyle w:val="Heading3"/>
@@ -10212,18 +10425,18 @@
           <wp:inline>
             <wp:extent cx="5334000" cy="4316873"/>
             <wp:effectExtent b="0" l="0" r="0" t="0"/>
-            <wp:docPr descr="Matrice de confusion" title="" id="118" name="Picture"/>
+            <wp:docPr descr="Matrice de confusion" title="" id="127" name="Picture"/>
             <a:graphic>
               <a:graphicData uri="http://schemas.openxmlformats.org/drawingml/2006/picture">
                 <pic:pic>
                   <pic:nvPicPr>
-                    <pic:cNvPr descr="../data/processed/graphiques/05_matrice_confusion.png" id="119" name="Picture"/>
+                    <pic:cNvPr descr="../data/processed/graphiques/05_matrice_confusion.png" id="128" name="Picture"/>
                     <pic:cNvPicPr>
                       <a:picLocks noChangeArrowheads="1" noChangeAspect="1"/>
                     </pic:cNvPicPr>
                   </pic:nvPicPr>
                   <pic:blipFill>
-                    <a:blip r:embed="rId117"/>
+                    <a:blip r:embed="rId126"/>
                     <a:stretch>
                       <a:fillRect/>
                     </a:stretch>
@@ -10366,8 +10579,8 @@
         <w:t xml:space="preserve">: aucune attaque manquée</w:t>
       </w:r>
     </w:p>
-    <w:bookmarkEnd w:id="120"/>
-    <w:bookmarkStart w:id="123" w:name="courbes-roc"/>
+    <w:bookmarkEnd w:id="129"/>
+    <w:bookmarkStart w:id="132" w:name="courbes-roc"/>
     <w:p>
       <w:pPr>
         <w:pStyle w:val="Heading3"/>
@@ -10385,18 +10598,18 @@
           <wp:inline>
             <wp:extent cx="5334000" cy="4252783"/>
             <wp:effectExtent b="0" l="0" r="0" t="0"/>
-            <wp:docPr descr="Courbes ROC" title="" id="121" name="Picture"/>
+            <wp:docPr descr="Courbes ROC" title="" id="130" name="Picture"/>
             <a:graphic>
               <a:graphicData uri="http://schemas.openxmlformats.org/drawingml/2006/picture">
                 <pic:pic>
                   <pic:nvPicPr>
-                    <pic:cNvPr descr="../data/processed/graphiques/04_courbes_roc.png" id="122" name="Picture"/>
+                    <pic:cNvPr descr="../data/processed/graphiques/04_courbes_roc.png" id="131" name="Picture"/>
                     <pic:cNvPicPr>
                       <a:picLocks noChangeArrowheads="1" noChangeAspect="1"/>
                     </pic:cNvPicPr>
                   </pic:nvPicPr>
                   <pic:blipFill>
-                    <a:blip r:embed="rId84"/>
+                    <a:blip r:embed="rId87"/>
                     <a:stretch>
                       <a:fillRect/>
                     </a:stretch>
@@ -10451,8 +10664,8 @@
         <w:t xml:space="preserve">Les courbes ROC montrent que la plupart des modèles atteignent une AUC parfaite (1.0000), indiquant une excellente capacité de discrimination entre les classes normale et malveillante. La courbe ROC du classifieur aléatoire (diagonale en pointillés, AUC = 0.5) est fournie comme référence. Les courbes ROC qui passent par le point (0,1) indiquent un classifieur parfait avec 0% de faux positifs et 100% de détection.</w:t>
       </w:r>
     </w:p>
-    <w:bookmarkEnd w:id="123"/>
-    <w:bookmarkStart w:id="127" w:name="importance-des-caractéristiques"/>
+    <w:bookmarkEnd w:id="132"/>
+    <w:bookmarkStart w:id="136" w:name="importance-des-caractéristiques"/>
     <w:p>
       <w:pPr>
         <w:pStyle w:val="Heading3"/>
@@ -10470,18 +10683,18 @@
           <wp:inline>
             <wp:extent cx="5334000" cy="3171567"/>
             <wp:effectExtent b="0" l="0" r="0" t="0"/>
-            <wp:docPr descr="Importance des caractéristiques" title="" id="125" name="Picture"/>
+            <wp:docPr descr="Importance des caractéristiques" title="" id="134" name="Picture"/>
             <a:graphic>
               <a:graphicData uri="http://schemas.openxmlformats.org/drawingml/2006/picture">
                 <pic:pic>
                   <pic:nvPicPr>
-                    <pic:cNvPr descr="../data/processed/graphiques/07_importance_caracteristiques.png" id="126" name="Picture"/>
+                    <pic:cNvPr descr="../data/processed/graphiques/07_importance_caracteristiques.png" id="135" name="Picture"/>
                     <pic:cNvPicPr>
                       <a:picLocks noChangeArrowheads="1" noChangeAspect="1"/>
                     </pic:cNvPicPr>
                   </pic:nvPicPr>
                   <pic:blipFill>
-                    <a:blip r:embed="rId124"/>
+                    <a:blip r:embed="rId133"/>
                     <a:stretch>
                       <a:fillRect/>
                     </a:stretch>
@@ -10554,8 +10767,8 @@
         <w:t xml:space="preserve">- Interpréter le comportement du modèle</w:t>
       </w:r>
     </w:p>
-    <w:bookmarkEnd w:id="127"/>
-    <w:bookmarkStart w:id="131" w:name="taux-de-détection-vs-faux-positifs"/>
+    <w:bookmarkEnd w:id="136"/>
+    <w:bookmarkStart w:id="140" w:name="taux-de-détection-vs-faux-positifs"/>
     <w:p>
       <w:pPr>
         <w:pStyle w:val="Heading3"/>
@@ -10573,18 +10786,18 @@
           <wp:inline>
             <wp:extent cx="5334000" cy="4130842"/>
             <wp:effectExtent b="0" l="0" r="0" t="0"/>
-            <wp:docPr descr="Détection vs Faux positifs" title="" id="129" name="Picture"/>
+            <wp:docPr descr="Détection vs Faux positifs" title="" id="138" name="Picture"/>
             <a:graphic>
               <a:graphicData uri="http://schemas.openxmlformats.org/drawingml/2006/picture">
                 <pic:pic>
                   <pic:nvPicPr>
-                    <pic:cNvPr descr="../data/processed/graphiques/09_detection_vs_faux_positifs.png" id="130" name="Picture"/>
+                    <pic:cNvPr descr="../data/processed/graphiques/09_detection_vs_faux_positifs.png" id="139" name="Picture"/>
                     <pic:cNvPicPr>
                       <a:picLocks noChangeArrowheads="1" noChangeAspect="1"/>
                     </pic:cNvPicPr>
                   </pic:nvPicPr>
                   <pic:blipFill>
-                    <a:blip r:embed="rId128"/>
+                    <a:blip r:embed="rId137"/>
                     <a:stretch>
                       <a:fillRect/>
                     </a:stretch>
@@ -10639,9 +10852,9 @@
         <w:t xml:space="preserve">Ce graphique positionne chaque modèle selon deux critères essentiels en sécurité : la capacité à détecter les attaques (TPR) et la tendance à générer de fausses alarmes (FPR). La zone idéale se situe en haut à gauche du graphique (détection maximale, faux positifs minimaux).</w:t>
       </w:r>
     </w:p>
-    <w:bookmarkEnd w:id="131"/>
-    <w:bookmarkEnd w:id="132"/>
-    <w:bookmarkStart w:id="136" w:name="analyse-comparative"/>
+    <w:bookmarkEnd w:id="140"/>
+    <w:bookmarkEnd w:id="141"/>
+    <w:bookmarkStart w:id="145" w:name="analyse-comparative"/>
     <w:p>
       <w:pPr>
         <w:pStyle w:val="Heading2"/>
@@ -10650,7 +10863,7 @@
         <w:t xml:space="preserve">6.2 Analyse comparative</w:t>
       </w:r>
     </w:p>
-    <w:bookmarkStart w:id="133" w:name="quel-modèle-est-le-meilleur"/>
+    <w:bookmarkStart w:id="142" w:name="quel-modèle-est-le-meilleur"/>
     <w:p>
       <w:pPr>
         <w:pStyle w:val="Heading3"/>
@@ -10771,8 +10984,8 @@
         <w:t xml:space="preserve">: Performant sur différents types de données</w:t>
       </w:r>
     </w:p>
-    <w:bookmarkEnd w:id="133"/>
-    <w:bookmarkStart w:id="134" w:name="X7cbed6fc305fefc534512b1181dadcac89819a6"/>
+    <w:bookmarkEnd w:id="142"/>
+    <w:bookmarkStart w:id="143" w:name="X7cbed6fc305fefc534512b1181dadcac89819a6"/>
     <w:p>
       <w:pPr>
         <w:pStyle w:val="Heading3"/>
@@ -10873,8 +11086,8 @@
         <w:t xml:space="preserve">: L’estimation de l’importance des caractéristiques et la validation croisée out-of-bag (OOB) sont fournies gratuitement.</w:t>
       </w:r>
     </w:p>
-    <w:bookmarkEnd w:id="134"/>
-    <w:bookmarkStart w:id="135" w:name="comparaison-avec-les-autres-modèles"/>
+    <w:bookmarkEnd w:id="143"/>
+    <w:bookmarkStart w:id="144" w:name="comparaison-avec-les-autres-modèles"/>
     <w:p>
       <w:pPr>
         <w:pStyle w:val="Heading3"/>
@@ -10993,9 +11206,9 @@
         <w:t xml:space="preserve">: Très rapide mais moins performant sur des données corrélées</w:t>
       </w:r>
     </w:p>
-    <w:bookmarkEnd w:id="135"/>
-    <w:bookmarkEnd w:id="136"/>
-    <w:bookmarkStart w:id="139" w:name="discussion-et-limites"/>
+    <w:bookmarkEnd w:id="144"/>
+    <w:bookmarkEnd w:id="145"/>
+    <w:bookmarkStart w:id="148" w:name="discussion-et-limites"/>
     <w:p>
       <w:pPr>
         <w:pStyle w:val="Heading2"/>
@@ -11004,7 +11217,7 @@
         <w:t xml:space="preserve">6.3 Discussion et limites</w:t>
       </w:r>
     </w:p>
-    <w:bookmarkStart w:id="137" w:name="limites-de-létude"/>
+    <w:bookmarkStart w:id="146" w:name="limites-de-létude"/>
     <w:p>
       <w:pPr>
         <w:pStyle w:val="Heading3"/>
@@ -11139,8 +11352,8 @@
         <w:t xml:space="preserve">: Ces algorithmes avancés de boosting, mentionnés dans la revue de littérature, n’ont pas été implémentés dans le projet. Leur ajout permettrait une comparaison plus complète.</w:t>
       </w:r>
     </w:p>
-    <w:bookmarkEnd w:id="137"/>
-    <w:bookmarkStart w:id="138" w:name="pistes-damélioration"/>
+    <w:bookmarkEnd w:id="146"/>
+    <w:bookmarkStart w:id="147" w:name="pistes-damélioration"/>
     <w:p>
       <w:pPr>
         <w:pStyle w:val="Heading3"/>
@@ -11268,41 +11481,227 @@
     </w:p>
     <w:p>
       <w:pPr>
+        <w:pStyle w:val="BlockText"/>
+      </w:pPr>
+      <w:r>
+        <w:rPr>
+          <w:b/>
+          <w:bCs/>
+        </w:rPr>
+        <w:t xml:space="preserve">Remarque</w:t>
+      </w:r>
+      <w:r>
+        <w:t xml:space="preserve"> </w:t>
+      </w:r>
+      <w:r>
+        <w:t xml:space="preserve">: Les résultats parfaits (F1=1.0 pour 4 modèles) s’expliquent par la nature synthétique du dataset. Sur des données réelles (CICIDS2017), les performances seraient plus nuancées, bien que le Random Forest conserve généralement son avance.</w:t>
+      </w:r>
+    </w:p>
+    <w:bookmarkEnd w:id="147"/>
+    <w:bookmarkEnd w:id="148"/>
+    <w:bookmarkEnd w:id="149"/>
+    <w:bookmarkStart w:id="158" w:name="conclusion"/>
+    <w:p>
+      <w:pPr>
+        <w:pStyle w:val="Heading1"/>
+      </w:pPr>
+      <w:r>
+        <w:t xml:space="preserve">Conclusion</w:t>
+      </w:r>
+    </w:p>
+    <w:bookmarkStart w:id="150" w:name="résumé-du-travail"/>
+    <w:p>
+      <w:pPr>
+        <w:pStyle w:val="Heading2"/>
+      </w:pPr>
+      <w:r>
+        <w:t xml:space="preserve">Résumé du travail</w:t>
+      </w:r>
+    </w:p>
+    <w:p>
+      <w:pPr>
         <w:pStyle w:val="FirstParagraph"/>
       </w:pPr>
       <w:r>
-        <w:rPr>
-          <w:b/>
-          <w:bCs/>
-        </w:rPr>
-        <w:t xml:space="preserve">Remarque</w:t>
-      </w:r>
-      <w:r>
-        <w:t xml:space="preserve"> </w:t>
-      </w:r>
-      <w:r>
-        <w:t xml:space="preserve">: Les résultats parfaits (F1=1.0 pour 4 modèles) s’expliquent par la nature synthétique du dataset. Sur des données réelles (CICIDS2017), les performances seraient plus nuancées, bien que le Random Forest conserve généralement son avance.</w:t>
-      </w:r>
-    </w:p>
-    <w:bookmarkEnd w:id="138"/>
-    <w:bookmarkEnd w:id="139"/>
-    <w:bookmarkEnd w:id="140"/>
-    <w:bookmarkStart w:id="149" w:name="conclusion"/>
-    <w:p>
-      <w:pPr>
-        <w:pStyle w:val="Heading1"/>
-      </w:pPr>
-      <w:r>
-        <w:t xml:space="preserve">Conclusion</w:t>
-      </w:r>
-    </w:p>
-    <w:bookmarkStart w:id="141" w:name="résumé-du-travail"/>
+        <w:t xml:space="preserve">Ce mémoire a présenté la conception et le développement de</w:t>
+      </w:r>
+      <w:r>
+        <w:t xml:space="preserve"> </w:t>
+      </w:r>
+      <w:r>
+        <w:rPr>
+          <w:b/>
+          <w:bCs/>
+        </w:rPr>
+        <w:t xml:space="preserve">NetGuard AI</w:t>
+      </w:r>
+      <w:r>
+        <w:t xml:space="preserve">, un système intelligent de détection d’intrusions réseau basé sur l’apprentissage automatique.</w:t>
+      </w:r>
+    </w:p>
+    <w:p>
+      <w:pPr>
+        <w:pStyle w:val="BodyText"/>
+      </w:pPr>
+      <w:r>
+        <w:t xml:space="preserve">Le travail accompli comprend :</w:t>
+      </w:r>
+    </w:p>
+    <w:p>
+      <w:pPr>
+        <w:numPr>
+          <w:ilvl w:val="0"/>
+          <w:numId w:val="1037"/>
+        </w:numPr>
+      </w:pPr>
+      <w:r>
+        <w:rPr>
+          <w:b/>
+          <w:bCs/>
+        </w:rPr>
+        <w:t xml:space="preserve">Une revue de littérature complète</w:t>
+      </w:r>
+      <w:r>
+        <w:t xml:space="preserve"> </w:t>
+      </w:r>
+      <w:r>
+        <w:t xml:space="preserve">sur les réseaux informatiques, les menaces réseau, les systèmes de détection d’intrusions et les algorithmes de Machine Learning.</w:t>
+      </w:r>
+    </w:p>
+    <w:p>
+      <w:pPr>
+        <w:numPr>
+          <w:ilvl w:val="0"/>
+          <w:numId w:val="1037"/>
+        </w:numPr>
+      </w:pPr>
+      <w:r>
+        <w:rPr>
+          <w:b/>
+          <w:bCs/>
+        </w:rPr>
+        <w:t xml:space="preserve">Le développement d’un pipeline de prétraitement robuste</w:t>
+      </w:r>
+      <w:r>
+        <w:t xml:space="preserve"> </w:t>
+      </w:r>
+      <w:r>
+        <w:t xml:space="preserve">en huit étapes : chargement, nettoyage, gestion des valeurs manquantes, encodage, normalisation, sélection des caractéristiques, séparation train/test et sauvegarde.</w:t>
+      </w:r>
+    </w:p>
+    <w:p>
+      <w:pPr>
+        <w:numPr>
+          <w:ilvl w:val="0"/>
+          <w:numId w:val="1037"/>
+        </w:numPr>
+      </w:pPr>
+      <w:r>
+        <w:rPr>
+          <w:b/>
+          <w:bCs/>
+        </w:rPr>
+        <w:t xml:space="preserve">L’implémentation de six modèles de classification supervisée</w:t>
+      </w:r>
+      <w:r>
+        <w:t xml:space="preserve"> </w:t>
+      </w:r>
+      <w:r>
+        <w:t xml:space="preserve">: Decision Tree, Random Forest, Logistic Regression, SVM, KNN et Naive Bayes, chacun avec ses hyperparamètres spécifiques.</w:t>
+      </w:r>
+    </w:p>
+    <w:p>
+      <w:pPr>
+        <w:numPr>
+          <w:ilvl w:val="0"/>
+          <w:numId w:val="1037"/>
+        </w:numPr>
+      </w:pPr>
+      <w:r>
+        <w:rPr>
+          <w:b/>
+          <w:bCs/>
+        </w:rPr>
+        <w:t xml:space="preserve">Un module d’évaluation complet</w:t>
+      </w:r>
+      <w:r>
+        <w:t xml:space="preserve"> </w:t>
+      </w:r>
+      <w:r>
+        <w:t xml:space="preserve">calculant sept métriques : accuracy, précision, rappel, F1-score, matrice de confusion, taux de détection et taux de faux positifs.</w:t>
+      </w:r>
+    </w:p>
+    <w:p>
+      <w:pPr>
+        <w:numPr>
+          <w:ilvl w:val="0"/>
+          <w:numId w:val="1037"/>
+        </w:numPr>
+      </w:pPr>
+      <w:r>
+        <w:rPr>
+          <w:b/>
+          <w:bCs/>
+        </w:rPr>
+        <w:t xml:space="preserve">Une interface utilisateur moderne</w:t>
+      </w:r>
+      <w:r>
+        <w:t xml:space="preserve"> </w:t>
+      </w:r>
+      <w:r>
+        <w:t xml:space="preserve">incluant une application web Streamlit, une interface en ligne de commande et un script de démonstration.</w:t>
+      </w:r>
+    </w:p>
+    <w:p>
+      <w:pPr>
+        <w:numPr>
+          <w:ilvl w:val="0"/>
+          <w:numId w:val="1037"/>
+        </w:numPr>
+      </w:pPr>
+      <w:r>
+        <w:rPr>
+          <w:b/>
+          <w:bCs/>
+        </w:rPr>
+        <w:t xml:space="preserve">93 tests unitaires</w:t>
+      </w:r>
+      <w:r>
+        <w:t xml:space="preserve"> </w:t>
+      </w:r>
+      <w:r>
+        <w:t xml:space="preserve">garantissant la fiabilité du code.</w:t>
+      </w:r>
+    </w:p>
+    <w:p>
+      <w:pPr>
+        <w:numPr>
+          <w:ilvl w:val="0"/>
+          <w:numId w:val="1037"/>
+        </w:numPr>
+      </w:pPr>
+      <w:r>
+        <w:rPr>
+          <w:b/>
+          <w:bCs/>
+        </w:rPr>
+        <w:t xml:space="preserve">10 graphiques</w:t>
+      </w:r>
+      <w:r>
+        <w:t xml:space="preserve"> </w:t>
+      </w:r>
+      <w:r>
+        <w:t xml:space="preserve">générés automatiquement pour visualiser les résultats.</w:t>
+      </w:r>
+    </w:p>
+    <w:bookmarkEnd w:id="150"/>
+    <w:bookmarkStart w:id="151" w:name="réponse-à-la-problématique"/>
     <w:p>
       <w:pPr>
         <w:pStyle w:val="Heading2"/>
       </w:pPr>
       <w:r>
-        <w:t xml:space="preserve">Résumé du travail</w:t>
+        <w:t xml:space="preserve">Réponse à la problématique</w:t>
       </w:r>
     </w:p>
     <w:p>
@@ -11310,20 +11709,11 @@
         <w:pStyle w:val="FirstParagraph"/>
       </w:pPr>
       <w:r>
-        <w:t xml:space="preserve">Ce mémoire a présenté la conception et le développement de</w:t>
-      </w:r>
-      <w:r>
-        <w:t xml:space="preserve"> </w:t>
-      </w:r>
-      <w:r>
-        <w:rPr>
-          <w:b/>
-          <w:bCs/>
-        </w:rPr>
-        <w:t xml:space="preserve">NetGuard AI</w:t>
-      </w:r>
-      <w:r>
-        <w:t xml:space="preserve">, un système intelligent de détection d’intrusions réseau basé sur l’apprentissage automatique.</w:t>
+        <w:rPr>
+          <w:b/>
+          <w:bCs/>
+        </w:rPr>
+        <w:t xml:space="preserve">Comment concevoir un système intelligent capable de détecter efficacement les intrusions réseau grâce aux techniques de Machine Learning ?</w:t>
       </w:r>
     </w:p>
     <w:p>
@@ -11331,164 +11721,109 @@
         <w:pStyle w:val="BodyText"/>
       </w:pPr>
       <w:r>
-        <w:t xml:space="preserve">Le travail accompli comprend :</w:t>
-      </w:r>
-    </w:p>
-    <w:p>
-      <w:pPr>
-        <w:numPr>
-          <w:ilvl w:val="0"/>
-          <w:numId w:val="1037"/>
-        </w:numPr>
-      </w:pPr>
-      <w:r>
-        <w:rPr>
-          <w:b/>
-          <w:bCs/>
-        </w:rPr>
-        <w:t xml:space="preserve">Une revue de littérature complète</w:t>
-      </w:r>
-      <w:r>
-        <w:t xml:space="preserve"> </w:t>
-      </w:r>
-      <w:r>
-        <w:t xml:space="preserve">sur les réseaux informatiques, les menaces réseau, les systèmes de détection d’intrusions et les algorithmes de Machine Learning.</w:t>
-      </w:r>
-    </w:p>
-    <w:p>
-      <w:pPr>
-        <w:numPr>
-          <w:ilvl w:val="0"/>
-          <w:numId w:val="1037"/>
-        </w:numPr>
-      </w:pPr>
-      <w:r>
-        <w:rPr>
-          <w:b/>
-          <w:bCs/>
-        </w:rPr>
-        <w:t xml:space="preserve">Le développement d’un pipeline de prétraitement robuste</w:t>
-      </w:r>
-      <w:r>
-        <w:t xml:space="preserve"> </w:t>
-      </w:r>
-      <w:r>
-        <w:t xml:space="preserve">en huit étapes : chargement, nettoyage, gestion des valeurs manquantes, encodage, normalisation, sélection des caractéristiques, séparation train/test et sauvegarde.</w:t>
-      </w:r>
-    </w:p>
-    <w:p>
-      <w:pPr>
-        <w:numPr>
-          <w:ilvl w:val="0"/>
-          <w:numId w:val="1037"/>
-        </w:numPr>
-      </w:pPr>
-      <w:r>
-        <w:rPr>
-          <w:b/>
-          <w:bCs/>
-        </w:rPr>
-        <w:t xml:space="preserve">L’implémentation de six modèles de classification supervisée</w:t>
-      </w:r>
-      <w:r>
-        <w:t xml:space="preserve"> </w:t>
-      </w:r>
-      <w:r>
-        <w:t xml:space="preserve">: Decision Tree, Random Forest, Logistic Regression, SVM, KNN et Naive Bayes, chacun avec ses hyperparamètres spécifiques.</w:t>
-      </w:r>
-    </w:p>
-    <w:p>
-      <w:pPr>
-        <w:numPr>
-          <w:ilvl w:val="0"/>
-          <w:numId w:val="1037"/>
-        </w:numPr>
-      </w:pPr>
-      <w:r>
-        <w:rPr>
-          <w:b/>
-          <w:bCs/>
-        </w:rPr>
-        <w:t xml:space="preserve">Un module d’évaluation complet</w:t>
-      </w:r>
-      <w:r>
-        <w:t xml:space="preserve"> </w:t>
-      </w:r>
-      <w:r>
-        <w:t xml:space="preserve">calculant sept métriques : accuracy, précision, rappel, F1-score, matrice de confusion, taux de détection et taux de faux positifs.</w:t>
-      </w:r>
-    </w:p>
-    <w:p>
-      <w:pPr>
-        <w:numPr>
-          <w:ilvl w:val="0"/>
-          <w:numId w:val="1037"/>
-        </w:numPr>
-      </w:pPr>
-      <w:r>
-        <w:rPr>
-          <w:b/>
-          <w:bCs/>
-        </w:rPr>
-        <w:t xml:space="preserve">Une interface utilisateur moderne</w:t>
-      </w:r>
-      <w:r>
-        <w:t xml:space="preserve"> </w:t>
-      </w:r>
-      <w:r>
-        <w:t xml:space="preserve">incluant une application web Streamlit, une interface en ligne de commande et un script de démonstration.</w:t>
-      </w:r>
-    </w:p>
-    <w:p>
-      <w:pPr>
-        <w:numPr>
-          <w:ilvl w:val="0"/>
-          <w:numId w:val="1037"/>
-        </w:numPr>
-      </w:pPr>
-      <w:r>
-        <w:rPr>
-          <w:b/>
-          <w:bCs/>
-        </w:rPr>
-        <w:t xml:space="preserve">93 tests unitaires</w:t>
-      </w:r>
-      <w:r>
-        <w:t xml:space="preserve"> </w:t>
-      </w:r>
-      <w:r>
-        <w:t xml:space="preserve">garantissant la fiabilité du code.</w:t>
-      </w:r>
-    </w:p>
-    <w:p>
-      <w:pPr>
-        <w:numPr>
-          <w:ilvl w:val="0"/>
-          <w:numId w:val="1037"/>
-        </w:numPr>
-      </w:pPr>
-      <w:r>
-        <w:rPr>
-          <w:b/>
-          <w:bCs/>
-        </w:rPr>
-        <w:t xml:space="preserve">10 graphiques</w:t>
-      </w:r>
-      <w:r>
-        <w:t xml:space="preserve"> </w:t>
-      </w:r>
-      <w:r>
-        <w:t xml:space="preserve">générés automatiquement pour visualiser les résultats.</w:t>
-      </w:r>
-    </w:p>
-    <w:bookmarkEnd w:id="141"/>
-    <w:bookmarkStart w:id="142" w:name="réponse-à-la-problématique"/>
+        <w:t xml:space="preserve">Ce projet démontre qu’un système de détection d’intrusions basé sur le Machine Learning est non seulement réalisable mais aussi efficace. La réponse à la problématique repose sur plusieurs piliers :</w:t>
+      </w:r>
+    </w:p>
+    <w:p>
+      <w:pPr>
+        <w:numPr>
+          <w:ilvl w:val="0"/>
+          <w:numId w:val="1038"/>
+        </w:numPr>
+      </w:pPr>
+      <w:r>
+        <w:rPr>
+          <w:b/>
+          <w:bCs/>
+        </w:rPr>
+        <w:t xml:space="preserve">Choix des algorithmes</w:t>
+      </w:r>
+      <w:r>
+        <w:t xml:space="preserve"> </w:t>
+      </w:r>
+      <w:r>
+        <w:t xml:space="preserve">: Le Random Forest s’impose comme le meilleur compromis entre performance (F1-Score parfait), robustesse et interprétabilité. Sa nature d’ensemble lui permet de résister au surapprentissage tout en capturant des relations complexes dans les données.</w:t>
+      </w:r>
+    </w:p>
+    <w:p>
+      <w:pPr>
+        <w:numPr>
+          <w:ilvl w:val="0"/>
+          <w:numId w:val="1038"/>
+        </w:numPr>
+      </w:pPr>
+      <w:r>
+        <w:rPr>
+          <w:b/>
+          <w:bCs/>
+        </w:rPr>
+        <w:t xml:space="preserve">Prétraitement rigoureux</w:t>
+      </w:r>
+      <w:r>
+        <w:t xml:space="preserve"> </w:t>
+      </w:r>
+      <w:r>
+        <w:t xml:space="preserve">: La qualité des prédictions dépend directement de la qualité du prétraitement. Le pipeline développé garantit des données propres, normalisées et prêtes pour l’entraînement.</w:t>
+      </w:r>
+    </w:p>
+    <w:p>
+      <w:pPr>
+        <w:numPr>
+          <w:ilvl w:val="0"/>
+          <w:numId w:val="1038"/>
+        </w:numPr>
+      </w:pPr>
+      <w:r>
+        <w:rPr>
+          <w:b/>
+          <w:bCs/>
+        </w:rPr>
+        <w:t xml:space="preserve">Évaluation multi-critères</w:t>
+      </w:r>
+      <w:r>
+        <w:t xml:space="preserve"> </w:t>
+      </w:r>
+      <w:r>
+        <w:t xml:space="preserve">: L’utilisation de métriques complémentaires (Accuracy, Précision, Rappel, F1-Score, courbe ROC) permet une évaluation nuancée des performances, essentielle en sécurité où les coûts des faux positifs et des faux négatifs sont très différents.</w:t>
+      </w:r>
+    </w:p>
+    <w:p>
+      <w:pPr>
+        <w:numPr>
+          <w:ilvl w:val="0"/>
+          <w:numId w:val="1038"/>
+        </w:numPr>
+      </w:pPr>
+      <w:r>
+        <w:rPr>
+          <w:b/>
+          <w:bCs/>
+        </w:rPr>
+        <w:t xml:space="preserve">Architecture modulaire</w:t>
+      </w:r>
+      <w:r>
+        <w:t xml:space="preserve"> </w:t>
+      </w:r>
+      <w:r>
+        <w:t xml:space="preserve">: La conception du système (packages séparés par responsabilité, configuration centralisée, tests unitaires) facilite la maintenance, l’extension et la réutilisation du code.</w:t>
+      </w:r>
+    </w:p>
+    <w:p>
+      <w:pPr>
+        <w:pStyle w:val="FirstParagraph"/>
+      </w:pPr>
+      <w:r>
+        <w:t xml:space="preserve">Le système développé, bien que testé principalement sur des données synthétiques, constitue une preuve de concept solide pour une solution de détection d’intrusions par Machine Learning.</w:t>
+      </w:r>
+    </w:p>
+    <w:bookmarkEnd w:id="151"/>
+    <w:bookmarkStart w:id="157" w:name="perspectives"/>
     <w:p>
       <w:pPr>
         <w:pStyle w:val="Heading2"/>
       </w:pPr>
       <w:r>
-        <w:t xml:space="preserve">Réponse à la problématique</w:t>
+        <w:t xml:space="preserve">Perspectives</w:t>
       </w:r>
     </w:p>
     <w:p>
@@ -11496,103 +11831,16 @@
         <w:pStyle w:val="FirstParagraph"/>
       </w:pPr>
       <w:r>
-        <w:rPr>
-          <w:b/>
-          <w:bCs/>
-        </w:rPr>
-        <w:t xml:space="preserve">Comment concevoir un système intelligent capable de détecter efficacement les intrusions réseau grâce aux techniques de Machine Learning ?</w:t>
-      </w:r>
-    </w:p>
-    <w:p>
-      <w:pPr>
-        <w:pStyle w:val="BodyText"/>
-      </w:pPr>
-      <w:r>
-        <w:t xml:space="preserve">Ce projet démontre qu’un système de détection d’intrusions basé sur le Machine Learning est non seulement réalisable mais aussi efficace. La réponse à la problématique repose sur plusieurs piliers :</w:t>
-      </w:r>
-    </w:p>
-    <w:p>
-      <w:pPr>
-        <w:numPr>
-          <w:ilvl w:val="0"/>
-          <w:numId w:val="1038"/>
-        </w:numPr>
-      </w:pPr>
-      <w:r>
-        <w:rPr>
-          <w:b/>
-          <w:bCs/>
-        </w:rPr>
-        <w:t xml:space="preserve">Choix des algorithmes</w:t>
-      </w:r>
-      <w:r>
-        <w:t xml:space="preserve"> </w:t>
-      </w:r>
-      <w:r>
-        <w:t xml:space="preserve">: Le Random Forest s’impose comme le meilleur compromis entre performance (F1-Score parfait), robustesse et interprétabilité. Sa nature d’ensemble lui permet de résister au surapprentissage tout en capturant des relations complexes dans les données.</w:t>
-      </w:r>
-    </w:p>
-    <w:p>
-      <w:pPr>
-        <w:numPr>
-          <w:ilvl w:val="0"/>
-          <w:numId w:val="1038"/>
-        </w:numPr>
-      </w:pPr>
-      <w:r>
-        <w:rPr>
-          <w:b/>
-          <w:bCs/>
-        </w:rPr>
-        <w:t xml:space="preserve">Prétraitement rigoureux</w:t>
-      </w:r>
-      <w:r>
-        <w:t xml:space="preserve"> </w:t>
-      </w:r>
-      <w:r>
-        <w:t xml:space="preserve">: La qualité des prédictions dépend directement de la qualité du prétraitement. Le pipeline développé garantit des données propres, normalisées et prêtes pour l’entraînement.</w:t>
-      </w:r>
-    </w:p>
-    <w:p>
-      <w:pPr>
-        <w:numPr>
-          <w:ilvl w:val="0"/>
-          <w:numId w:val="1038"/>
-        </w:numPr>
-      </w:pPr>
-      <w:r>
-        <w:rPr>
-          <w:b/>
-          <w:bCs/>
-        </w:rPr>
-        <w:t xml:space="preserve">Évaluation multi-critères</w:t>
-      </w:r>
-      <w:r>
-        <w:t xml:space="preserve"> </w:t>
-      </w:r>
-      <w:r>
-        <w:t xml:space="preserve">: L’utilisation de métriques complémentaires (Accuracy, Précision, Rappel, F1-Score, courbe ROC) permet une évaluation nuancée des performances, essentielle en sécurité où les coûts des faux positifs et des faux négatifs sont très différents.</w:t>
-      </w:r>
-    </w:p>
-    <w:p>
-      <w:pPr>
-        <w:numPr>
-          <w:ilvl w:val="0"/>
-          <w:numId w:val="1038"/>
-        </w:numPr>
-      </w:pPr>
-      <w:r>
-        <w:rPr>
-          <w:b/>
-          <w:bCs/>
-        </w:rPr>
-        <w:t xml:space="preserve">Architecture modulaire</w:t>
-      </w:r>
-      <w:r>
-        <w:t xml:space="preserve"> </w:t>
-      </w:r>
-      <w:r>
-        <w:t xml:space="preserve">: La conception du système (packages séparés par responsabilité, configuration centralisée, tests unitaires) facilite la maintenance, l’extension et la réutilisation du code.</w:t>
+        <w:t xml:space="preserve">Plusieurs perspectives d’amélioration et d’extension du projet sont envisageables :</w:t>
+      </w:r>
+    </w:p>
+    <w:bookmarkStart w:id="152" w:name="deep-learning"/>
+    <w:p>
+      <w:pPr>
+        <w:pStyle w:val="Heading3"/>
+      </w:pPr>
+      <w:r>
+        <w:t xml:space="preserve">Deep Learning</w:t>
       </w:r>
     </w:p>
     <w:p>
@@ -11600,17 +11848,105 @@
         <w:pStyle w:val="FirstParagraph"/>
       </w:pPr>
       <w:r>
-        <w:t xml:space="preserve">Le système développé, bien que testé principalement sur des données synthétiques, constitue une preuve de concept solide pour une solution de détection d’intrusions par Machine Learning.</w:t>
-      </w:r>
-    </w:p>
-    <w:bookmarkEnd w:id="142"/>
-    <w:bookmarkStart w:id="148" w:name="perspectives"/>
-    <w:p>
-      <w:pPr>
-        <w:pStyle w:val="Heading2"/>
-      </w:pPr>
-      <w:r>
-        <w:t xml:space="preserve">Perspectives</w:t>
+        <w:t xml:space="preserve">L’utilisation de réseaux de neurones profonds (Deep Learning) pourrait améliorer les performances, notamment sur des données réelles complexes. Les architectures prometteuses incluent :</w:t>
+      </w:r>
+      <w:r>
+        <w:t xml:space="preserve"> </w:t>
+      </w:r>
+      <w:r>
+        <w:t xml:space="preserve">-</w:t>
+      </w:r>
+      <w:r>
+        <w:t xml:space="preserve"> </w:t>
+      </w:r>
+      <w:r>
+        <w:rPr>
+          <w:b/>
+          <w:bCs/>
+        </w:rPr>
+        <w:t xml:space="preserve">MLP (Multi-Layer Perceptron)</w:t>
+      </w:r>
+      <w:r>
+        <w:t xml:space="preserve"> </w:t>
+      </w:r>
+      <w:r>
+        <w:t xml:space="preserve">: Réseau fully-connected pour la classification</w:t>
+      </w:r>
+      <w:r>
+        <w:t xml:space="preserve"> </w:t>
+      </w:r>
+      <w:r>
+        <w:t xml:space="preserve">-</w:t>
+      </w:r>
+      <w:r>
+        <w:t xml:space="preserve"> </w:t>
+      </w:r>
+      <w:r>
+        <w:rPr>
+          <w:b/>
+          <w:bCs/>
+        </w:rPr>
+        <w:t xml:space="preserve">CNN (Convolutional Neural Network)</w:t>
+      </w:r>
+      <w:r>
+        <w:t xml:space="preserve"> </w:t>
+      </w:r>
+      <w:r>
+        <w:t xml:space="preserve">: Adaptation du trafic réseau en images pour utiliser des convolutions</w:t>
+      </w:r>
+      <w:r>
+        <w:t xml:space="preserve"> </w:t>
+      </w:r>
+      <w:r>
+        <w:t xml:space="preserve">-</w:t>
+      </w:r>
+      <w:r>
+        <w:t xml:space="preserve"> </w:t>
+      </w:r>
+      <w:r>
+        <w:rPr>
+          <w:b/>
+          <w:bCs/>
+        </w:rPr>
+        <w:t xml:space="preserve">LSTM (Long Short-Term Memory)</w:t>
+      </w:r>
+      <w:r>
+        <w:t xml:space="preserve"> </w:t>
+      </w:r>
+      <w:r>
+        <w:t xml:space="preserve">: Capture des dépendances temporelles dans les flux réseau</w:t>
+      </w:r>
+      <w:r>
+        <w:t xml:space="preserve"> </w:t>
+      </w:r>
+      <w:r>
+        <w:t xml:space="preserve">-</w:t>
+      </w:r>
+      <w:r>
+        <w:t xml:space="preserve"> </w:t>
+      </w:r>
+      <w:r>
+        <w:rPr>
+          <w:b/>
+          <w:bCs/>
+        </w:rPr>
+        <w:t xml:space="preserve">Autoencoders</w:t>
+      </w:r>
+      <w:r>
+        <w:t xml:space="preserve"> </w:t>
+      </w:r>
+      <w:r>
+        <w:t xml:space="preserve">: Détection d’anomalies par reconstruction</w:t>
+      </w:r>
+    </w:p>
+    <w:bookmarkEnd w:id="152"/>
+    <w:bookmarkStart w:id="153" w:name="détection-en-temps-réel"/>
+    <w:p>
+      <w:pPr>
+        <w:pStyle w:val="Heading3"/>
+      </w:pPr>
+      <w:r>
+        <w:t xml:space="preserve">Détection en temps réel</w:t>
       </w:r>
     </w:p>
     <w:p>
@@ -11618,16 +11954,41 @@
         <w:pStyle w:val="FirstParagraph"/>
       </w:pPr>
       <w:r>
-        <w:t xml:space="preserve">Plusieurs perspectives d’amélioration et d’extension du projet sont envisageables :</w:t>
-      </w:r>
-    </w:p>
-    <w:bookmarkStart w:id="143" w:name="deep-learning"/>
+        <w:t xml:space="preserve">Le système pourrait être adapté pour une détection en temps réel en :</w:t>
+      </w:r>
+      <w:r>
+        <w:t xml:space="preserve"> </w:t>
+      </w:r>
+      <w:r>
+        <w:t xml:space="preserve">- Utilisant un buffer circulaire pour l’analyse en continu des flux</w:t>
+      </w:r>
+      <w:r>
+        <w:t xml:space="preserve"> </w:t>
+      </w:r>
+      <w:r>
+        <w:t xml:space="preserve">- Implémentant un système de fenêtrage temporel glissant</w:t>
+      </w:r>
+      <w:r>
+        <w:t xml:space="preserve"> </w:t>
+      </w:r>
+      <w:r>
+        <w:t xml:space="preserve">- Optimisant les modèles pour l’inférence rapide (ONNX, TensorRT)</w:t>
+      </w:r>
+      <w:r>
+        <w:t xml:space="preserve"> </w:t>
+      </w:r>
+      <w:r>
+        <w:t xml:space="preserve">- Parallélisant le traitement avec multiprocessing</w:t>
+      </w:r>
+    </w:p>
+    <w:bookmarkEnd w:id="153"/>
+    <w:bookmarkStart w:id="154" w:name="intégration-avec-un-siem"/>
     <w:p>
       <w:pPr>
         <w:pStyle w:val="Heading3"/>
       </w:pPr>
       <w:r>
-        <w:t xml:space="preserve">Deep Learning</w:t>
+        <w:t xml:space="preserve">Intégration avec un SIEM</w:t>
       </w:r>
     </w:p>
     <w:p>
@@ -11635,105 +11996,41 @@
         <w:pStyle w:val="FirstParagraph"/>
       </w:pPr>
       <w:r>
-        <w:t xml:space="preserve">L’utilisation de réseaux de neurones profonds (Deep Learning) pourrait améliorer les performances, notamment sur des données réelles complexes. Les architectures prometteuses incluent :</w:t>
-      </w:r>
-      <w:r>
-        <w:t xml:space="preserve"> </w:t>
-      </w:r>
-      <w:r>
-        <w:t xml:space="preserve">-</w:t>
-      </w:r>
-      <w:r>
-        <w:t xml:space="preserve"> </w:t>
-      </w:r>
-      <w:r>
-        <w:rPr>
-          <w:b/>
-          <w:bCs/>
-        </w:rPr>
-        <w:t xml:space="preserve">MLP (Multi-Layer Perceptron)</w:t>
-      </w:r>
-      <w:r>
-        <w:t xml:space="preserve"> </w:t>
-      </w:r>
-      <w:r>
-        <w:t xml:space="preserve">: Réseau fully-connected pour la classification</w:t>
-      </w:r>
-      <w:r>
-        <w:t xml:space="preserve"> </w:t>
-      </w:r>
-      <w:r>
-        <w:t xml:space="preserve">-</w:t>
-      </w:r>
-      <w:r>
-        <w:t xml:space="preserve"> </w:t>
-      </w:r>
-      <w:r>
-        <w:rPr>
-          <w:b/>
-          <w:bCs/>
-        </w:rPr>
-        <w:t xml:space="preserve">CNN (Convolutional Neural Network)</w:t>
-      </w:r>
-      <w:r>
-        <w:t xml:space="preserve"> </w:t>
-      </w:r>
-      <w:r>
-        <w:t xml:space="preserve">: Adaptation du trafic réseau en images pour utiliser des convolutions</w:t>
-      </w:r>
-      <w:r>
-        <w:t xml:space="preserve"> </w:t>
-      </w:r>
-      <w:r>
-        <w:t xml:space="preserve">-</w:t>
-      </w:r>
-      <w:r>
-        <w:t xml:space="preserve"> </w:t>
-      </w:r>
-      <w:r>
-        <w:rPr>
-          <w:b/>
-          <w:bCs/>
-        </w:rPr>
-        <w:t xml:space="preserve">LSTM (Long Short-Term Memory)</w:t>
-      </w:r>
-      <w:r>
-        <w:t xml:space="preserve"> </w:t>
-      </w:r>
-      <w:r>
-        <w:t xml:space="preserve">: Capture des dépendances temporelles dans les flux réseau</w:t>
-      </w:r>
-      <w:r>
-        <w:t xml:space="preserve"> </w:t>
-      </w:r>
-      <w:r>
-        <w:t xml:space="preserve">-</w:t>
-      </w:r>
-      <w:r>
-        <w:t xml:space="preserve"> </w:t>
-      </w:r>
-      <w:r>
-        <w:rPr>
-          <w:b/>
-          <w:bCs/>
-        </w:rPr>
-        <w:t xml:space="preserve">Autoencoders</w:t>
-      </w:r>
-      <w:r>
-        <w:t xml:space="preserve"> </w:t>
-      </w:r>
-      <w:r>
-        <w:t xml:space="preserve">: Détection d’anomalies par reconstruction</w:t>
-      </w:r>
-    </w:p>
-    <w:bookmarkEnd w:id="143"/>
-    <w:bookmarkStart w:id="144" w:name="détection-en-temps-réel"/>
+        <w:t xml:space="preserve">L’intégration avec un Security Information and Event Management (SIEM) permettrait :</w:t>
+      </w:r>
+      <w:r>
+        <w:t xml:space="preserve"> </w:t>
+      </w:r>
+      <w:r>
+        <w:t xml:space="preserve">- L’envoi automatique des alertes vers une plateforme centralisée</w:t>
+      </w:r>
+      <w:r>
+        <w:t xml:space="preserve"> </w:t>
+      </w:r>
+      <w:r>
+        <w:t xml:space="preserve">- La corrélation avec d’autres sources de sécurité</w:t>
+      </w:r>
+      <w:r>
+        <w:t xml:space="preserve"> </w:t>
+      </w:r>
+      <w:r>
+        <w:t xml:space="preserve">- Le déclenchement de réponses automatiques (containment, blocking)</w:t>
+      </w:r>
+      <w:r>
+        <w:t xml:space="preserve"> </w:t>
+      </w:r>
+      <w:r>
+        <w:t xml:space="preserve">- La génération de rapports de sécurité automatisés</w:t>
+      </w:r>
+    </w:p>
+    <w:bookmarkEnd w:id="154"/>
+    <w:bookmarkStart w:id="155" w:name="déploiement-sur-un-réseau-réel"/>
     <w:p>
       <w:pPr>
         <w:pStyle w:val="Heading3"/>
       </w:pPr>
       <w:r>
-        <w:t xml:space="preserve">Détection en temps réel</w:t>
+        <w:t xml:space="preserve">Déploiement sur un réseau réel</w:t>
       </w:r>
     </w:p>
     <w:p>
@@ -11741,90 +12038,6 @@
         <w:pStyle w:val="FirstParagraph"/>
       </w:pPr>
       <w:r>
-        <w:t xml:space="preserve">Le système pourrait être adapté pour une détection en temps réel en :</w:t>
-      </w:r>
-      <w:r>
-        <w:t xml:space="preserve"> </w:t>
-      </w:r>
-      <w:r>
-        <w:t xml:space="preserve">- Utilisant un buffer circulaire pour l’analyse en continu des flux</w:t>
-      </w:r>
-      <w:r>
-        <w:t xml:space="preserve"> </w:t>
-      </w:r>
-      <w:r>
-        <w:t xml:space="preserve">- Implémentant un système de fenêtrage temporel glissant</w:t>
-      </w:r>
-      <w:r>
-        <w:t xml:space="preserve"> </w:t>
-      </w:r>
-      <w:r>
-        <w:t xml:space="preserve">- Optimisant les modèles pour l’inférence rapide (ONNX, TensorRT)</w:t>
-      </w:r>
-      <w:r>
-        <w:t xml:space="preserve"> </w:t>
-      </w:r>
-      <w:r>
-        <w:t xml:space="preserve">- Parallélisant le traitement avec multiprocessing</w:t>
-      </w:r>
-    </w:p>
-    <w:bookmarkEnd w:id="144"/>
-    <w:bookmarkStart w:id="145" w:name="intégration-avec-un-siem"/>
-    <w:p>
-      <w:pPr>
-        <w:pStyle w:val="Heading3"/>
-      </w:pPr>
-      <w:r>
-        <w:t xml:space="preserve">Intégration avec un SIEM</w:t>
-      </w:r>
-    </w:p>
-    <w:p>
-      <w:pPr>
-        <w:pStyle w:val="FirstParagraph"/>
-      </w:pPr>
-      <w:r>
-        <w:t xml:space="preserve">L’intégration avec un Security Information and Event Management (SIEM) permettrait :</w:t>
-      </w:r>
-      <w:r>
-        <w:t xml:space="preserve"> </w:t>
-      </w:r>
-      <w:r>
-        <w:t xml:space="preserve">- L’envoi automatique des alertes vers une plateforme centralisée</w:t>
-      </w:r>
-      <w:r>
-        <w:t xml:space="preserve"> </w:t>
-      </w:r>
-      <w:r>
-        <w:t xml:space="preserve">- La corrélation avec d’autres sources de sécurité</w:t>
-      </w:r>
-      <w:r>
-        <w:t xml:space="preserve"> </w:t>
-      </w:r>
-      <w:r>
-        <w:t xml:space="preserve">- Le déclenchement de réponses automatiques (containment, blocking)</w:t>
-      </w:r>
-      <w:r>
-        <w:t xml:space="preserve"> </w:t>
-      </w:r>
-      <w:r>
-        <w:t xml:space="preserve">- La génération de rapports de sécurité automatisés</w:t>
-      </w:r>
-    </w:p>
-    <w:bookmarkEnd w:id="145"/>
-    <w:bookmarkStart w:id="146" w:name="déploiement-sur-un-réseau-réel"/>
-    <w:p>
-      <w:pPr>
-        <w:pStyle w:val="Heading3"/>
-      </w:pPr>
-      <w:r>
-        <w:t xml:space="preserve">Déploiement sur un réseau réel</w:t>
-      </w:r>
-    </w:p>
-    <w:p>
-      <w:pPr>
-        <w:pStyle w:val="FirstParagraph"/>
-      </w:pPr>
-      <w:r>
         <w:t xml:space="preserve">Le déploiement sur un réseau réel nécessiterait :</w:t>
       </w:r>
       <w:r>
@@ -11852,8 +12065,8 @@
         <w:t xml:space="preserve">- Le respect des contraintes de performance (latence, débit)</w:t>
       </w:r>
     </w:p>
-    <w:bookmarkEnd w:id="146"/>
-    <w:bookmarkStart w:id="147" w:name="extensions-fonctionnelles"/>
+    <w:bookmarkEnd w:id="155"/>
+    <w:bookmarkStart w:id="156" w:name="extensions-fonctionnelles"/>
     <w:p>
       <w:pPr>
         <w:pStyle w:val="Heading3"/>
@@ -11957,10 +12170,10 @@
         </w:pict>
       </w:r>
     </w:p>
-    <w:bookmarkEnd w:id="147"/>
-    <w:bookmarkEnd w:id="148"/>
-    <w:bookmarkEnd w:id="149"/>
-    <w:bookmarkStart w:id="150" w:name="bibliographie"/>
+    <w:bookmarkEnd w:id="156"/>
+    <w:bookmarkEnd w:id="157"/>
+    <w:bookmarkEnd w:id="158"/>
+    <w:bookmarkStart w:id="159" w:name="bibliographie"/>
     <w:p>
       <w:pPr>
         <w:pStyle w:val="Heading1"/>
@@ -12726,7 +12939,7 @@
         <w:t xml:space="preserve">Projet NetGuard AI — Master en Informatique — Année universitaire 2025-2026</w:t>
       </w:r>
     </w:p>
-    <w:bookmarkEnd w:id="150"/>
+    <w:bookmarkEnd w:id="159"/>
     <w:sectPr>
       <w:footnotePr>
         <w:numRestart w:val="eachSect"/>

</xml_diff>